<commit_message>
feat: add markdown editor tab with file management, preview, and DOCX splitting features to make.py
</commit_message>
<xml_diff>
--- a/Bao_Cao_Tieu_Luan_NMCNPM_new.docx
+++ b/Bao_Cao_Tieu_Luan_NMCNPM_new.docx
@@ -2886,7 +2886,7 @@
               <w:rPr>
                 <w:sz w:val="22"/>
               </w:rPr>
-              <w:t>Hệ thống tính lương đa biến theo Nghị định 38/2022/NĐ-CP: giờ hành chính, tăng ca (hệ số 1.5/2.0/3.0), ca đêm (hệ số +30%), phụ cấp và khấu trừ</w:t>
+              <w:t>Hệ thống tính lương theo 2 loại ca cố định: ca sáng và ca tối; áp dụng hệ số riêng cho ngày thường, cuối tuần và ngày lễ</w:t>
             </w:r>
           </w:p>
         </w:tc>
@@ -4764,7 +4764,7 @@
               <w:rPr>
                 <w:sz w:val="22"/>
               </w:rPr>
-              <w:t>Hồ sơ NV, phân ca, GPS check-in/out, tính lương NĐ38, RBAC</w:t>
+              <w:t>Hồ sơ NV, phân ca sáng/tối, GPS check-in/out, tính lương theo ca với hệ số cuối tuần/lễ, RBAC</w:t>
             </w:r>
           </w:p>
         </w:tc>
@@ -5459,7 +5459,7 @@
               <w:rPr>
                 <w:sz w:val="22"/>
               </w:rPr>
-              <w:t>Tính lương đa biến theo NĐ 38/2022: giờ hành chính, tăng ca (×1.5/2.0/3.0), ca đêm (+30%)</w:t>
+              <w:t>Tính lương theo 2 loại ca cố định: ca sáng và ca tối; có hệ số riêng cho ngày thường, cuối tuần và ngày lễ</w:t>
             </w:r>
           </w:p>
         </w:tc>
@@ -7280,7 +7280,7 @@
           <w:i/>
           <w:color w:val="555555"/>
         </w:rPr>
-        <w:t>**Nguyên tắc Snapshot:** `luong_gio_tai_thoi_diem` được lưu cứng tại kỳ tính lương — đảm bảo lịch sử tài chính không đổi khi mức lương điều chỉnh.</w:t>
+        <w:t>**Nguyên tắc Snapshot:** Mức lương theo ca tại thời điểm chốt công được lưu cố định cùng kỳ tính lương — đảm bảo lịch sử tài chính không đổi khi đơn giá ca được điều chỉnh.</w:t>
       </w:r>
     </w:p>
     <w:p/>
@@ -7569,20 +7569,20 @@
               <w:rPr>
                 <w:sz w:val="22"/>
               </w:rPr>
-              <w:t>so_gio_lam = 0 nếu check_out_time IS NULL</w:t>
-            </w:r>
-          </w:p>
-        </w:tc>
-        <w:tc>
-          <w:tcPr>
-            <w:tcW w:type="dxa" w:w="3024"/>
-          </w:tcPr>
-          <w:p>
-            <w:r>
-              <w:rPr>
-                <w:sz w:val="22"/>
-              </w:rPr>
-              <w:t>CASE WHEN trong câu truy vấn tính lương</w:t>
+              <w:t>Chỉ ca có đủ check_in_time và check_out_time mới được đưa vào bảng lương</w:t>
+            </w:r>
+          </w:p>
+        </w:tc>
+        <w:tc>
+          <w:tcPr>
+            <w:tcW w:type="dxa" w:w="3024"/>
+          </w:tcPr>
+          <w:p>
+            <w:r>
+              <w:rPr>
+                <w:sz w:val="22"/>
+              </w:rPr>
+              <w:t>CASE WHEN hoặc cờ trạng thái hợp lệ khi tổng hợp lương</w:t>
             </w:r>
           </w:p>
         </w:tc>
@@ -7654,20 +7654,20 @@
               <w:rPr>
                 <w:sz w:val="22"/>
               </w:rPr>
-              <w:t>Ca cuối tuần (T7, CN) nhân hệ số 1.5</w:t>
-            </w:r>
-          </w:p>
-        </w:tc>
-        <w:tc>
-          <w:tcPr>
-            <w:tcW w:type="dxa" w:w="3024"/>
-          </w:tcPr>
-          <w:p>
-            <w:r>
-              <w:rPr>
-                <w:sz w:val="22"/>
-              </w:rPr>
-              <w:t>Hàm tính lương kiểm tra DAYOFWEEK(ngay_lam_viec)</w:t>
+              <w:t>Mỗi ca phải thuộc đúng 1 trong 2 loại: sang hoặc toi</w:t>
+            </w:r>
+          </w:p>
+        </w:tc>
+        <w:tc>
+          <w:tcPr>
+            <w:tcW w:type="dxa" w:w="3024"/>
+          </w:tcPr>
+          <w:p>
+            <w:r>
+              <w:rPr>
+                <w:sz w:val="22"/>
+              </w:rPr>
+              <w:t>Ràng buộc ENUM / validation tại bảng shift_template và shift</w:t>
             </w:r>
           </w:p>
         </w:tc>
@@ -8750,7 +8750,7 @@
           <w:i/>
           <w:color w:val="555555"/>
         </w:rPr>
-        <w:t>**Trái tim của báo cáo — Chiếm ~50%.** Đặc tả đầy đủ nghiệp vụ UC04 do **Nguyễn Viết Tùng** phụ trách: phân công ca, check-in/out sinh trắc học, tính lương đa biến NĐ38 và phân quyền RBAC.</w:t>
+        <w:t>**Trái tim của báo cáo — Chiếm ~50%.** Đặc tả đầy đủ nghiệp vụ UC04 do **Nguyễn Viết Tùng** phụ trách: phân công ca, check-in/out sinh trắc học, tính lương theo 2 ca sáng/tối có hệ số cuối tuần/ngày lễ và phân quyền RBAC.</w:t>
       </w:r>
     </w:p>
     <w:p/>
@@ -9741,20 +9741,20 @@
               <w:rPr>
                 <w:sz w:val="22"/>
               </w:rPr>
-              <w:t>Lương theo giờ &lt; mức lương tối thiểu vùng</w:t>
-            </w:r>
-          </w:p>
-        </w:tc>
-        <w:tc>
-          <w:tcPr>
-            <w:tcW w:type="dxa" w:w="3024"/>
-          </w:tcPr>
-          <w:p>
-            <w:r>
-              <w:rPr>
-                <w:sz w:val="22"/>
-              </w:rPr>
-              <w:t>Cảnh báo: _"Mức lương thấp hơn quy định (22.500đ/giờ). Xác nhận tiếp tục?"_</w:t>
+              <w:t>Mức lương ca nhập vào không hợp lệ</w:t>
+            </w:r>
+          </w:p>
+        </w:tc>
+        <w:tc>
+          <w:tcPr>
+            <w:tcW w:type="dxa" w:w="3024"/>
+          </w:tcPr>
+          <w:p>
+            <w:r>
+              <w:rPr>
+                <w:sz w:val="22"/>
+              </w:rPr>
+              <w:t>Cảnh báo: _"Mức lương ca chưa phù hợp. Vui lòng kiểm tra lại hoặc xác nhận tiếp tục."_</w:t>
             </w:r>
           </w:p>
         </w:tc>
@@ -12146,7 +12146,7 @@
           <w:rFonts w:ascii="Cambria Math" w:hAnsi="Cambria Math"/>
           <w:sz w:val="24"/>
         </w:rPr>
-        <w:t>$$L_{nv} = \sum_{i=1}^{n} \left[ (t_{checkout_i} - t_{checkin_i}) \times r_{ca_i} \right] - P_{tre} + B_{bonus}$$</w:t>
+        <w:t>$$L_{nv} = \sum (N_{sang,thuong} \times R_{sang}) + \sum (N_{toi,thuong} \times R_{toi}) + \sum (N_{cuoi_tuan} \times R_{ca} \times 1.5) + \sum (N_{ngay_le} \times R_{ca} \times 2.0)$$</w:t>
       </w:r>
     </w:p>
     <w:p/>
@@ -12174,7 +12174,7 @@
         <w:ind w:left="0"/>
       </w:pPr>
       <w:r>
-        <w:t>$t_{checkout_i} - t_{checkin_i}$: Số giờ làm thực tế của ca $i$ (tính bằng giờ, làm tròn 2 chữ số thập phân)</w:t>
+        <w:t>$N_{sang,thuong}$: Số ca sáng ngày thường đã hoàn thành trong kỳ</w:t>
       </w:r>
     </w:p>
     <w:p>
@@ -12183,7 +12183,7 @@
         <w:ind w:left="0"/>
       </w:pPr>
       <w:r>
-        <w:t>$r_{ca_i}$: Đơn giá giờ của ca $i$ (có thể khác nhau giữa ca thường và ca cuối tuần/lễ)</w:t>
+        <w:t>$N_{toi,thuong}$: Số ca tối ngày thường đã hoàn thành trong kỳ</w:t>
       </w:r>
     </w:p>
     <w:p>
@@ -12192,7 +12192,7 @@
         <w:ind w:left="0"/>
       </w:pPr>
       <w:r>
-        <w:t>$P_{tre}$: Khoản khấu trừ do đi muộn (nếu có, theo chính sách)</w:t>
+        <w:t>$N_{cuoi_tuan}$: Số ca hoàn thành rơi vào Thứ 7 hoặc Chủ nhật</w:t>
       </w:r>
     </w:p>
     <w:p>
@@ -12201,7 +12201,47 @@
         <w:ind w:left="0"/>
       </w:pPr>
       <w:r>
-        <w:t>$B_{bonus}$: Thưởng thêm (nếu Quản lý nhập thủ công)</w:t>
+        <w:t>$N_{ngay_le}$: Số ca hoàn thành trong ngày lễ</w:t>
+      </w:r>
+    </w:p>
+    <w:p>
+      <w:pPr>
+        <w:pStyle w:val="ListBullet"/>
+        <w:ind w:left="0"/>
+      </w:pPr>
+      <w:r>
+        <w:t>$R_{sang}$: Mức lương cố định cho một ca sáng</w:t>
+      </w:r>
+    </w:p>
+    <w:p>
+      <w:pPr>
+        <w:pStyle w:val="ListBullet"/>
+        <w:ind w:left="0"/>
+      </w:pPr>
+      <w:r>
+        <w:t>$R_{toi}$: Mức lương cố định cho một ca tối</w:t>
+      </w:r>
+    </w:p>
+    <w:p>
+      <w:pPr>
+        <w:pStyle w:val="ListBullet"/>
+        <w:ind w:left="0"/>
+      </w:pPr>
+      <w:r>
+        <w:t>$R_{ca}$: Mức lương gốc của ca sáng hoặc ca tối tương ứng</w:t>
+      </w:r>
+    </w:p>
+    <w:p/>
+    <w:p>
+      <w:pPr>
+        <w:ind w:left="567"/>
+      </w:pPr>
+      <w:r>
+        <w:rPr>
+          <w:i/>
+          <w:color w:val="555555"/>
+        </w:rPr>
+        <w:t>**Giả định đơn giản hóa:** Hệ thống chỉ quản lý 2 loại ca chuẩn: **ca sáng** và **ca tối**. Không xét ca đêm hay phụ cấp đêm. Tuy nhiên vẫn áp dụng hệ số tăng lương cho **cuối tuần** và **ngày lễ**.</w:t>
       </w:r>
     </w:p>
     <w:p/>
@@ -12952,16 +12992,16 @@
         <w:spacing w:after="80"/>
       </w:pPr>
       <w:r>
-        <w:t xml:space="preserve">Hệ thống loại bỏ công thức tính lương đơn giản và triển khai </w:t>
+        <w:t xml:space="preserve">Hệ thống áp dụng </w:t>
       </w:r>
       <w:r>
         <w:rPr>
           <w:b/>
         </w:rPr>
-        <w:t>động cơ tính lương đa biến</w:t>
-      </w:r>
-      <w:r>
-        <w:t xml:space="preserve"> tuân thủ đầy đủ pháp luật lao động Việt Nam:</w:t>
+        <w:t>mô hình tính lương gọn nhưng thực tế</w:t>
+      </w:r>
+      <w:r>
+        <w:t xml:space="preserve"> cho quán café:</w:t>
       </w:r>
     </w:p>
     <w:p/>
@@ -12974,7 +13014,7 @@
           <w:rFonts w:ascii="Cambria Math" w:hAnsi="Cambria Math"/>
           <w:sz w:val="24"/>
         </w:rPr>
-        <w:t>$$S_{total} = \sum_{i=1}^{n} \left( H_{basic,i} \times R \right) + \sum_{j=1}^{m} \left( H_{OT,j} \times R \times M_j \right) + \sum_{k=1}^{p} \left( H_{night,k} \times R \times N_k \right) + A_{total} - D_{total}$$</w:t>
+        <w:t>$$S_{total} = (N_{sang} \times R_{sang}) + (N_{toi} \times R_{toi}) + (N_{cuoi_tuan} \times R_{ca} \times 1.5) + (N_{ngay_le} \times R_{ca} \times 2.0)$$</w:t>
       </w:r>
     </w:p>
     <w:p/>
@@ -12986,7 +13026,7 @@
         <w:rPr>
           <w:b/>
         </w:rPr>
-        <w:t>Giải thích các biến số:</w:t>
+        <w:t>Quy ước ca làm việc:</w:t>
       </w:r>
     </w:p>
     <w:p/>
@@ -13014,7 +13054,7 @@
                 <w:color w:val="FFFFFF"/>
                 <w:sz w:val="22"/>
               </w:rPr>
-              <w:t>Biến</w:t>
+              <w:t>Loại ca</w:t>
             </w:r>
           </w:p>
         </w:tc>
@@ -13030,7 +13070,7 @@
                 <w:color w:val="FFFFFF"/>
                 <w:sz w:val="22"/>
               </w:rPr>
-              <w:t>Ý nghĩa</w:t>
+              <w:t>Khung giờ chuẩn</w:t>
             </w:r>
           </w:p>
         </w:tc>
@@ -13046,7 +13086,7 @@
                 <w:color w:val="FFFFFF"/>
                 <w:sz w:val="22"/>
               </w:rPr>
-              <w:t>Giá trị theo luật</w:t>
+              <w:t>Cách tính lương</w:t>
             </w:r>
           </w:p>
         </w:tc>
@@ -13061,33 +13101,33 @@
               <w:rPr>
                 <w:sz w:val="22"/>
               </w:rPr>
-              <w:t>$H_{basic,i}$</w:t>
-            </w:r>
-          </w:p>
-        </w:tc>
-        <w:tc>
-          <w:tcPr>
-            <w:tcW w:type="dxa" w:w="3024"/>
-          </w:tcPr>
-          <w:p>
-            <w:r>
-              <w:rPr>
-                <w:sz w:val="22"/>
-              </w:rPr>
-              <w:t>Giờ hành chính tiêu chuẩn</w:t>
-            </w:r>
-          </w:p>
-        </w:tc>
-        <w:tc>
-          <w:tcPr>
-            <w:tcW w:type="dxa" w:w="3024"/>
-          </w:tcPr>
-          <w:p>
-            <w:r>
-              <w:rPr>
-                <w:sz w:val="22"/>
-              </w:rPr>
-              <w:t>≤ 8h/ngày, ≤ 48h/tuần</w:t>
+              <w:t>Ca sáng</w:t>
+            </w:r>
+          </w:p>
+        </w:tc>
+        <w:tc>
+          <w:tcPr>
+            <w:tcW w:type="dxa" w:w="3024"/>
+          </w:tcPr>
+          <w:p>
+            <w:r>
+              <w:rPr>
+                <w:sz w:val="22"/>
+              </w:rPr>
+              <w:t>06:00 - 12:00</w:t>
+            </w:r>
+          </w:p>
+        </w:tc>
+        <w:tc>
+          <w:tcPr>
+            <w:tcW w:type="dxa" w:w="3024"/>
+          </w:tcPr>
+          <w:p>
+            <w:r>
+              <w:rPr>
+                <w:sz w:val="22"/>
+              </w:rPr>
+              <w:t>Cộng R_sang khi hoàn thành đủ ca</w:t>
             </w:r>
           </w:p>
         </w:tc>
@@ -13103,35 +13143,35 @@
               <w:rPr>
                 <w:sz w:val="22"/>
               </w:rPr>
-              <w:t>$R$</w:t>
-            </w:r>
-          </w:p>
-        </w:tc>
-        <w:tc>
-          <w:tcPr>
-            <w:tcW w:type="dxa" w:w="3024"/>
-            <w:shd w:val="clear" w:color="auto" w:fill="EBF4FB"/>
-          </w:tcPr>
-          <w:p>
-            <w:r>
-              <w:rPr>
-                <w:sz w:val="22"/>
-              </w:rPr>
-              <w:t>Lương cơ bản theo giờ</w:t>
-            </w:r>
-          </w:p>
-        </w:tc>
-        <w:tc>
-          <w:tcPr>
-            <w:tcW w:type="dxa" w:w="3024"/>
-            <w:shd w:val="clear" w:color="auto" w:fill="EBF4FB"/>
-          </w:tcPr>
-          <w:p>
-            <w:r>
-              <w:rPr>
-                <w:sz w:val="22"/>
-              </w:rPr>
-              <w:t>≥ 22.500 đ/giờ (Vùng I, 2024)</w:t>
+              <w:t>Ca tối</w:t>
+            </w:r>
+          </w:p>
+        </w:tc>
+        <w:tc>
+          <w:tcPr>
+            <w:tcW w:type="dxa" w:w="3024"/>
+            <w:shd w:val="clear" w:color="auto" w:fill="EBF4FB"/>
+          </w:tcPr>
+          <w:p>
+            <w:r>
+              <w:rPr>
+                <w:sz w:val="22"/>
+              </w:rPr>
+              <w:t>16:00 - 22:00</w:t>
+            </w:r>
+          </w:p>
+        </w:tc>
+        <w:tc>
+          <w:tcPr>
+            <w:tcW w:type="dxa" w:w="3024"/>
+            <w:shd w:val="clear" w:color="auto" w:fill="EBF4FB"/>
+          </w:tcPr>
+          <w:p>
+            <w:r>
+              <w:rPr>
+                <w:sz w:val="22"/>
+              </w:rPr>
+              <w:t>Cộng R_toi khi hoàn thành đủ ca</w:t>
             </w:r>
           </w:p>
         </w:tc>
@@ -13146,33 +13186,33 @@
               <w:rPr>
                 <w:sz w:val="22"/>
               </w:rPr>
-              <w:t>$H_{OT,j}$</w:t>
-            </w:r>
-          </w:p>
-        </w:tc>
-        <w:tc>
-          <w:tcPr>
-            <w:tcW w:type="dxa" w:w="3024"/>
-          </w:tcPr>
-          <w:p>
-            <w:r>
-              <w:rPr>
-                <w:sz w:val="22"/>
-              </w:rPr>
-              <w:t>Giờ làm thêm (tăng ca)</w:t>
-            </w:r>
-          </w:p>
-        </w:tc>
-        <w:tc>
-          <w:tcPr>
-            <w:tcW w:type="dxa" w:w="3024"/>
-          </w:tcPr>
-          <w:p>
-            <w:r>
-              <w:rPr>
-                <w:sz w:val="22"/>
-              </w:rPr>
-              <w:t>≤ 40h/tháng, ≤ 200h/năm</w:t>
+              <w:t>Ca cuối tuần</w:t>
+            </w:r>
+          </w:p>
+        </w:tc>
+        <w:tc>
+          <w:tcPr>
+            <w:tcW w:type="dxa" w:w="3024"/>
+          </w:tcPr>
+          <w:p>
+            <w:r>
+              <w:rPr>
+                <w:sz w:val="22"/>
+              </w:rPr>
+              <w:t>Theo ca sáng hoặc ca tối</w:t>
+            </w:r>
+          </w:p>
+        </w:tc>
+        <w:tc>
+          <w:tcPr>
+            <w:tcW w:type="dxa" w:w="3024"/>
+          </w:tcPr>
+          <w:p>
+            <w:r>
+              <w:rPr>
+                <w:sz w:val="22"/>
+              </w:rPr>
+              <w:t>Nhân hệ số 1.5 trên đơn giá ca tương ứng</w:t>
             </w:r>
           </w:p>
         </w:tc>
@@ -13188,205 +13228,35 @@
               <w:rPr>
                 <w:sz w:val="22"/>
               </w:rPr>
-              <w:t>$M_j$</w:t>
-            </w:r>
-          </w:p>
-        </w:tc>
-        <w:tc>
-          <w:tcPr>
-            <w:tcW w:type="dxa" w:w="3024"/>
-            <w:shd w:val="clear" w:color="auto" w:fill="EBF4FB"/>
-          </w:tcPr>
-          <w:p>
-            <w:r>
-              <w:rPr>
-                <w:sz w:val="22"/>
-              </w:rPr>
-              <w:t>Hệ số tăng ca</w:t>
-            </w:r>
-          </w:p>
-        </w:tc>
-        <w:tc>
-          <w:tcPr>
-            <w:tcW w:type="dxa" w:w="3024"/>
-            <w:shd w:val="clear" w:color="auto" w:fill="EBF4FB"/>
-          </w:tcPr>
-          <w:p>
-            <w:r>
-              <w:rPr>
-                <w:sz w:val="22"/>
-              </w:rPr>
-              <w:t>1.5 (ngày thường) / 2.0 (ngày nghỉ) / 3.0 (Lễ, Tết)</w:t>
-            </w:r>
-          </w:p>
-        </w:tc>
-      </w:tr>
-      <w:tr>
-        <w:tc>
-          <w:tcPr>
-            <w:tcW w:type="dxa" w:w="3024"/>
-          </w:tcPr>
-          <w:p>
-            <w:r>
-              <w:rPr>
-                <w:sz w:val="22"/>
-              </w:rPr>
-              <w:t>$H_{night,k}$</w:t>
-            </w:r>
-          </w:p>
-        </w:tc>
-        <w:tc>
-          <w:tcPr>
-            <w:tcW w:type="dxa" w:w="3024"/>
-          </w:tcPr>
-          <w:p>
-            <w:r>
-              <w:rPr>
-                <w:sz w:val="22"/>
-              </w:rPr>
-              <w:t>Giờ làm ca đêm (22:00–06:00)</w:t>
-            </w:r>
-          </w:p>
-        </w:tc>
-        <w:tc>
-          <w:tcPr>
-            <w:tcW w:type="dxa" w:w="3024"/>
-          </w:tcPr>
-          <w:p>
-            <w:r>
-              <w:rPr>
-                <w:sz w:val="22"/>
-              </w:rPr>
-              <w:t>Theo lịch thực tế</w:t>
-            </w:r>
-          </w:p>
-        </w:tc>
-      </w:tr>
-      <w:tr>
-        <w:tc>
-          <w:tcPr>
-            <w:tcW w:type="dxa" w:w="3024"/>
-            <w:shd w:val="clear" w:color="auto" w:fill="EBF4FB"/>
-          </w:tcPr>
-          <w:p>
-            <w:r>
-              <w:rPr>
-                <w:sz w:val="22"/>
-              </w:rPr>
-              <w:t>$N_k$</w:t>
-            </w:r>
-          </w:p>
-        </w:tc>
-        <w:tc>
-          <w:tcPr>
-            <w:tcW w:type="dxa" w:w="3024"/>
-            <w:shd w:val="clear" w:color="auto" w:fill="EBF4FB"/>
-          </w:tcPr>
-          <w:p>
-            <w:r>
-              <w:rPr>
-                <w:sz w:val="22"/>
-              </w:rPr>
-              <w:t>Hệ số phụ cấp đêm</w:t>
-            </w:r>
-          </w:p>
-        </w:tc>
-        <w:tc>
-          <w:tcPr>
-            <w:tcW w:type="dxa" w:w="3024"/>
-            <w:shd w:val="clear" w:color="auto" w:fill="EBF4FB"/>
-          </w:tcPr>
-          <w:p>
-            <w:r>
-              <w:rPr>
-                <w:sz w:val="22"/>
-              </w:rPr>
-              <w:t>+30% (≥ 1.3); nếu vừa tăng ca vừa đêm → cộng thêm +20%</w:t>
-            </w:r>
-          </w:p>
-        </w:tc>
-      </w:tr>
-      <w:tr>
-        <w:tc>
-          <w:tcPr>
-            <w:tcW w:type="dxa" w:w="3024"/>
-          </w:tcPr>
-          <w:p>
-            <w:r>
-              <w:rPr>
-                <w:sz w:val="22"/>
-              </w:rPr>
-              <w:t>$A_{total}$</w:t>
-            </w:r>
-          </w:p>
-        </w:tc>
-        <w:tc>
-          <w:tcPr>
-            <w:tcW w:type="dxa" w:w="3024"/>
-          </w:tcPr>
-          <w:p>
-            <w:r>
-              <w:rPr>
-                <w:sz w:val="22"/>
-              </w:rPr>
-              <w:t>Tổng phụ cấp (ăn ca, xăng xe...)</w:t>
-            </w:r>
-          </w:p>
-        </w:tc>
-        <w:tc>
-          <w:tcPr>
-            <w:tcW w:type="dxa" w:w="3024"/>
-          </w:tcPr>
-          <w:p>
-            <w:r>
-              <w:rPr>
-                <w:sz w:val="22"/>
-              </w:rPr>
-              <w:t>Theo chính sách quán</w:t>
-            </w:r>
-          </w:p>
-        </w:tc>
-      </w:tr>
-      <w:tr>
-        <w:tc>
-          <w:tcPr>
-            <w:tcW w:type="dxa" w:w="3024"/>
-            <w:shd w:val="clear" w:color="auto" w:fill="EBF4FB"/>
-          </w:tcPr>
-          <w:p>
-            <w:r>
-              <w:rPr>
-                <w:sz w:val="22"/>
-              </w:rPr>
-              <w:t>$D_{total}$</w:t>
-            </w:r>
-          </w:p>
-        </w:tc>
-        <w:tc>
-          <w:tcPr>
-            <w:tcW w:type="dxa" w:w="3024"/>
-            <w:shd w:val="clear" w:color="auto" w:fill="EBF4FB"/>
-          </w:tcPr>
-          <w:p>
-            <w:r>
-              <w:rPr>
-                <w:sz w:val="22"/>
-              </w:rPr>
-              <w:t>Tổng khấu trừ (BHXH, đi muộn...)</w:t>
-            </w:r>
-          </w:p>
-        </w:tc>
-        <w:tc>
-          <w:tcPr>
-            <w:tcW w:type="dxa" w:w="3024"/>
-            <w:shd w:val="clear" w:color="auto" w:fill="EBF4FB"/>
-          </w:tcPr>
-          <w:p>
-            <w:r>
-              <w:rPr>
-                <w:sz w:val="22"/>
-              </w:rPr>
-              <w:t>Theo chính sách + pháp luật</w:t>
+              <w:t>Ca ngày lễ</w:t>
+            </w:r>
+          </w:p>
+        </w:tc>
+        <w:tc>
+          <w:tcPr>
+            <w:tcW w:type="dxa" w:w="3024"/>
+            <w:shd w:val="clear" w:color="auto" w:fill="EBF4FB"/>
+          </w:tcPr>
+          <w:p>
+            <w:r>
+              <w:rPr>
+                <w:sz w:val="22"/>
+              </w:rPr>
+              <w:t>Theo ca sáng hoặc ca tối</w:t>
+            </w:r>
+          </w:p>
+        </w:tc>
+        <w:tc>
+          <w:tcPr>
+            <w:tcW w:type="dxa" w:w="3024"/>
+            <w:shd w:val="clear" w:color="auto" w:fill="EBF4FB"/>
+          </w:tcPr>
+          <w:p>
+            <w:r>
+              <w:rPr>
+                <w:sz w:val="22"/>
+              </w:rPr>
+              <w:t>Nhân hệ số 2.0 trên đơn giá ca tương ứng</w:t>
             </w:r>
           </w:p>
         </w:tc>
@@ -13402,20 +13272,112 @@
         <w:rPr>
           <w:b/>
         </w:rPr>
-        <w:t>Kiến trúc tách biệt hệ số khỏi mã nguồn:</w:t>
-      </w:r>
-    </w:p>
-    <w:p/>
-    <w:p>
-      <w:pPr>
-        <w:ind w:left="567"/>
-      </w:pPr>
+        <w:t>Nguyên tắc áp dụng:</w:t>
+      </w:r>
+    </w:p>
+    <w:p/>
+    <w:p>
+      <w:pPr>
+        <w:pStyle w:val="ListBullet"/>
+        <w:ind w:left="0"/>
+      </w:pPr>
+      <w:r>
+        <w:t xml:space="preserve">Chỉ tính lương cho ca có đủ cặp </w:t>
+      </w:r>
       <w:r>
         <w:rPr>
-          <w:i/>
-          <w:color w:val="555555"/>
+          <w:rFonts w:ascii="Courier New" w:hAnsi="Courier New"/>
+          <w:color w:val="C7254E"/>
+          <w:sz w:val="18"/>
         </w:rPr>
-        <w:t>Mọi hệ số $M_j$ và $N_k$ được lưu trong **Bảng ma trận cấu hình (Compliance Matrix)** riêng biệt trong CSDL, không hardcode vào logic code. Khi Chính phủ ban hành quy định mới, Nhân sự chỉ cần cập nhật bảng cấu hình mà **không cần phát hành phiên bản phần mềm mới**.</w:t>
+        <w:t>check-in</w:t>
+      </w:r>
+      <w:r>
+        <w:t xml:space="preserve"> và </w:t>
+      </w:r>
+      <w:r>
+        <w:rPr>
+          <w:rFonts w:ascii="Courier New" w:hAnsi="Courier New"/>
+          <w:color w:val="C7254E"/>
+          <w:sz w:val="18"/>
+        </w:rPr>
+        <w:t>check-out</w:t>
+      </w:r>
+    </w:p>
+    <w:p>
+      <w:pPr>
+        <w:pStyle w:val="ListBullet"/>
+        <w:ind w:left="0"/>
+      </w:pPr>
+      <w:r>
+        <w:t xml:space="preserve">Nếu quên </w:t>
+      </w:r>
+      <w:r>
+        <w:rPr>
+          <w:rFonts w:ascii="Courier New" w:hAnsi="Courier New"/>
+          <w:color w:val="C7254E"/>
+          <w:sz w:val="18"/>
+        </w:rPr>
+        <w:t>check-out</w:t>
+      </w:r>
+      <w:r>
+        <w:t>, bản ghi chuyển sang trạng thái chờ quản lý xác nhận trước khi tính lương</w:t>
+      </w:r>
+    </w:p>
+    <w:p>
+      <w:pPr>
+        <w:pStyle w:val="ListBullet"/>
+        <w:ind w:left="0"/>
+      </w:pPr>
+      <w:r>
+        <w:t>Mức lương theo ca được lưu ngay trong mẫu ca hoặc bản phân công ca</w:t>
+      </w:r>
+    </w:p>
+    <w:p>
+      <w:pPr>
+        <w:pStyle w:val="ListBullet"/>
+        <w:ind w:left="0"/>
+      </w:pPr>
+      <w:r>
+        <w:t>Hệ số cuối tuần/ngày lễ được cấu hình cố định trong phạm vi hệ thống; không triển khai phụ cấp ca đêm</w:t>
+      </w:r>
+    </w:p>
+    <w:p/>
+    <w:p>
+      <w:pPr>
+        <w:pStyle w:val="Heading3"/>
+        <w:ind w:left="283"/>
+      </w:pPr>
+      <w:r>
+        <w:rPr>
+          <w:rFonts w:ascii="Times New Roman" w:hAnsi="Times New Roman"/>
+          <w:b/>
+          <w:color w:val="2E86AB"/>
+          <w:sz w:val="26"/>
+        </w:rPr>
+        <w:t>3.6. Tính lương theo 2 ca cố định có hệ số cuối tuần/lễ</w:t>
+      </w:r>
+    </w:p>
+    <w:p/>
+    <w:p>
+      <w:pPr>
+        <w:spacing w:after="80"/>
+      </w:pPr>
+      <w:r>
+        <w:t>Hệ thống không sử dụng payroll engine đa biến đầy đủ. Thay vào đó, lương được tổng hợp theo số ca sáng và ca tối, sau đó áp hệ số nếu ca rơi vào cuối tuần hoặc ngày lễ:</w:t>
+      </w:r>
+    </w:p>
+    <w:p/>
+    <w:p>
+      <w:pPr>
+        <w:jc w:val="center"/>
+      </w:pPr>
+      <w:r>
+        <w:rPr>
+          <w:rFonts w:ascii="Cambria Math" w:hAnsi="Cambria Math"/>
+          <w:sz w:val="24"/>
+        </w:rPr>
+        <w:t>$$S_{total} = (N_{sang} \times R_{sang}) + (N_{toi} \times R_{toi}) + (N_{cuoi_tuan} \times R_{ca} \times 1.5) + (N_{ngay_le} \times R_{ca} \times 2.0)$$</w:t>
       </w:r>
     </w:p>
     <w:p/>
@@ -13442,7 +13404,7 @@
                 <w:color w:val="FFFFFF"/>
                 <w:sz w:val="22"/>
               </w:rPr>
-              <w:t>Bảng</w:t>
+              <w:t>Thành phần</w:t>
             </w:r>
           </w:p>
         </w:tc>
@@ -13458,7 +13420,7 @@
                 <w:color w:val="FFFFFF"/>
                 <w:sz w:val="22"/>
               </w:rPr>
-              <w:t>compliance_matrix</w:t>
+              <w:t>Ý nghĩa</w:t>
             </w:r>
           </w:p>
         </w:tc>
@@ -13473,7 +13435,7 @@
               <w:rPr>
                 <w:sz w:val="22"/>
               </w:rPr>
-              <w:t>loai_ca</w:t>
+              <w:t>$N_{sang}$</w:t>
             </w:r>
           </w:p>
         </w:tc>
@@ -13486,7 +13448,7 @@
               <w:rPr>
                 <w:sz w:val="22"/>
               </w:rPr>
-              <w:t>ENUM: 'ngay_thuong', 'ngay_nghi', 'le_tet', 'ca_dem'</w:t>
+              <w:t>Tổng số ca sáng hợp lệ trong kỳ</w:t>
             </w:r>
           </w:p>
         </w:tc>
@@ -13502,7 +13464,7 @@
               <w:rPr>
                 <w:sz w:val="22"/>
               </w:rPr>
-              <w:t>he_so</w:t>
+              <w:t>$N_{toi}$</w:t>
             </w:r>
           </w:p>
         </w:tc>
@@ -13516,7 +13478,7 @@
               <w:rPr>
                 <w:sz w:val="22"/>
               </w:rPr>
-              <w:t>DECIMAL(4,2) — hệ số áp dụng</w:t>
+              <w:t>Tổng số ca tối hợp lệ trong kỳ</w:t>
             </w:r>
           </w:p>
         </w:tc>
@@ -13531,7 +13493,7 @@
               <w:rPr>
                 <w:sz w:val="22"/>
               </w:rPr>
-              <w:t>hieu_luc_tu</w:t>
+              <w:t>$N_{cuoi_tuan}$</w:t>
             </w:r>
           </w:p>
         </w:tc>
@@ -13544,7 +13506,7 @@
               <w:rPr>
                 <w:sz w:val="22"/>
               </w:rPr>
-              <w:t>DATE — ngày bắt đầu hiệu lực</w:t>
+              <w:t>Tổng số ca hợp lệ trong cuối tuần</w:t>
             </w:r>
           </w:p>
         </w:tc>
@@ -13560,7 +13522,7 @@
               <w:rPr>
                 <w:sz w:val="22"/>
               </w:rPr>
-              <w:t>van_ban_phap_ly</w:t>
+              <w:t>$N_{ngay_le}$</w:t>
             </w:r>
           </w:p>
         </w:tc>
@@ -13574,7 +13536,123 @@
               <w:rPr>
                 <w:sz w:val="22"/>
               </w:rPr>
-              <w:t>VARCHAR — số nghị định tham chiếu</w:t>
+              <w:t>Tổng số ca hợp lệ trong ngày lễ</w:t>
+            </w:r>
+          </w:p>
+        </w:tc>
+      </w:tr>
+      <w:tr>
+        <w:tc>
+          <w:tcPr>
+            <w:tcW w:type="dxa" w:w="4535"/>
+          </w:tcPr>
+          <w:p>
+            <w:r>
+              <w:rPr>
+                <w:sz w:val="22"/>
+              </w:rPr>
+              <w:t>$R_{sang}$</w:t>
+            </w:r>
+          </w:p>
+        </w:tc>
+        <w:tc>
+          <w:tcPr>
+            <w:tcW w:type="dxa" w:w="4535"/>
+          </w:tcPr>
+          <w:p>
+            <w:r>
+              <w:rPr>
+                <w:sz w:val="22"/>
+              </w:rPr>
+              <w:t>Mức lương chuẩn cho 1 ca sáng</w:t>
+            </w:r>
+          </w:p>
+        </w:tc>
+      </w:tr>
+      <w:tr>
+        <w:tc>
+          <w:tcPr>
+            <w:tcW w:type="dxa" w:w="4535"/>
+            <w:shd w:val="clear" w:color="auto" w:fill="EBF4FB"/>
+          </w:tcPr>
+          <w:p>
+            <w:r>
+              <w:rPr>
+                <w:sz w:val="22"/>
+              </w:rPr>
+              <w:t>$R_{toi}$</w:t>
+            </w:r>
+          </w:p>
+        </w:tc>
+        <w:tc>
+          <w:tcPr>
+            <w:tcW w:type="dxa" w:w="4535"/>
+            <w:shd w:val="clear" w:color="auto" w:fill="EBF4FB"/>
+          </w:tcPr>
+          <w:p>
+            <w:r>
+              <w:rPr>
+                <w:sz w:val="22"/>
+              </w:rPr>
+              <w:t>Mức lương chuẩn cho 1 ca tối</w:t>
+            </w:r>
+          </w:p>
+        </w:tc>
+      </w:tr>
+      <w:tr>
+        <w:tc>
+          <w:tcPr>
+            <w:tcW w:type="dxa" w:w="4535"/>
+          </w:tcPr>
+          <w:p>
+            <w:r>
+              <w:rPr>
+                <w:sz w:val="22"/>
+              </w:rPr>
+              <w:t>Hệ số cuối tuần</w:t>
+            </w:r>
+          </w:p>
+        </w:tc>
+        <w:tc>
+          <w:tcPr>
+            <w:tcW w:type="dxa" w:w="4535"/>
+          </w:tcPr>
+          <w:p>
+            <w:r>
+              <w:rPr>
+                <w:sz w:val="22"/>
+              </w:rPr>
+              <w:t>1.5 lần đơn giá ca</w:t>
+            </w:r>
+          </w:p>
+        </w:tc>
+      </w:tr>
+      <w:tr>
+        <w:tc>
+          <w:tcPr>
+            <w:tcW w:type="dxa" w:w="4535"/>
+            <w:shd w:val="clear" w:color="auto" w:fill="EBF4FB"/>
+          </w:tcPr>
+          <w:p>
+            <w:r>
+              <w:rPr>
+                <w:sz w:val="22"/>
+              </w:rPr>
+              <w:t>Hệ số ngày lễ</w:t>
+            </w:r>
+          </w:p>
+        </w:tc>
+        <w:tc>
+          <w:tcPr>
+            <w:tcW w:type="dxa" w:w="4535"/>
+            <w:shd w:val="clear" w:color="auto" w:fill="EBF4FB"/>
+          </w:tcPr>
+          <w:p>
+            <w:r>
+              <w:rPr>
+                <w:sz w:val="22"/>
+              </w:rPr>
+              <w:t>2.0 lần đơn giá ca</w:t>
             </w:r>
           </w:p>
         </w:tc>
@@ -13584,655 +13662,167 @@
     <w:p/>
     <w:p>
       <w:pPr>
-        <w:pStyle w:val="Heading3"/>
-        <w:ind w:left="283"/>
-      </w:pPr>
-      <w:r>
-        <w:rPr>
-          <w:rFonts w:ascii="Times New Roman" w:hAnsi="Times New Roman"/>
-          <w:b/>
-          <w:color w:val="2E86AB"/>
-          <w:sz w:val="26"/>
-        </w:rPr>
-        <w:t>3.6. Payroll Engine Đa biến — Tuân thủ NĐ 38/2022/NĐ-CP</w:t>
-      </w:r>
-    </w:p>
-    <w:p/>
-    <w:p/>
-    <w:p>
-      <w:pPr>
         <w:spacing w:after="80"/>
       </w:pPr>
-      <w:r>
-        <w:t xml:space="preserve">Hệ thống loại bỏ công thức tính lương đơn giản và triển khai </w:t>
-      </w:r>
       <w:r>
         <w:rPr>
           <w:b/>
         </w:rPr>
-        <w:t>động cơ tính lương đa biến</w:t>
-      </w:r>
-      <w:r>
-        <w:t xml:space="preserve"> tuân thủ đầy đủ pháp luật lao động Việt Nam:</w:t>
-      </w:r>
-    </w:p>
-    <w:p/>
-    <w:p>
-      <w:pPr>
-        <w:jc w:val="center"/>
-      </w:pPr>
+        <w:t>Ví dụ minh họa:</w:t>
+      </w:r>
+    </w:p>
+    <w:p/>
+    <w:p>
+      <w:pPr>
+        <w:pStyle w:val="ListBullet"/>
+        <w:ind w:left="0"/>
+      </w:pPr>
+      <w:r>
+        <w:t xml:space="preserve">Nếu một nhân viên hoàn thành </w:t>
+      </w:r>
       <w:r>
         <w:rPr>
-          <w:rFonts w:ascii="Cambria Math" w:hAnsi="Cambria Math"/>
-          <w:sz w:val="24"/>
+          <w:rFonts w:ascii="Courier New" w:hAnsi="Courier New"/>
+          <w:color w:val="C7254E"/>
+          <w:sz w:val="18"/>
         </w:rPr>
-        <w:t>$$S_{total} = \sum_{i=1}^{n} \left( H_{basic,i} \times R \right) + \sum_{j=1}^{m} \left( H_{OT,j} \times R \times M_j \right) + \sum_{k=1}^{p} \left( H_{night,k} \times R \times N_k \right) + A_{total} - D_{total}$$</w:t>
-      </w:r>
-    </w:p>
-    <w:p/>
-    <w:p>
-      <w:pPr>
-        <w:spacing w:after="80"/>
-      </w:pPr>
+        <w:t>18</w:t>
+      </w:r>
+      <w:r>
+        <w:t xml:space="preserve"> ca sáng ngày thường với mức </w:t>
+      </w:r>
       <w:r>
         <w:rPr>
-          <w:b/>
+          <w:rFonts w:ascii="Courier New" w:hAnsi="Courier New"/>
+          <w:color w:val="C7254E"/>
+          <w:sz w:val="18"/>
         </w:rPr>
-        <w:t>Giải thích các biến số:</w:t>
-      </w:r>
-    </w:p>
-    <w:p/>
-    <w:tbl>
-      <w:tblPr>
-        <w:tblStyle w:val="TableGrid"/>
-        <w:tblW w:type="auto" w:w="0"/>
-        <w:tblLook w:firstColumn="1" w:firstRow="1" w:lastColumn="0" w:lastRow="0" w:noHBand="0" w:noVBand="1" w:val="04A0"/>
-      </w:tblPr>
-      <w:tblGrid>
-        <w:gridCol w:w="3024"/>
-        <w:gridCol w:w="3024"/>
-        <w:gridCol w:w="3024"/>
-      </w:tblGrid>
-      <w:tr>
-        <w:tc>
-          <w:tcPr>
-            <w:tcW w:type="dxa" w:w="3024"/>
-            <w:shd w:val="clear" w:color="auto" w:fill="1F619E"/>
-          </w:tcPr>
-          <w:p>
-            <w:r>
-              <w:rPr>
-                <w:b/>
-                <w:color w:val="FFFFFF"/>
-                <w:sz w:val="22"/>
-              </w:rPr>
-              <w:t>Biến</w:t>
-            </w:r>
-          </w:p>
-        </w:tc>
-        <w:tc>
-          <w:tcPr>
-            <w:tcW w:type="dxa" w:w="3024"/>
-            <w:shd w:val="clear" w:color="auto" w:fill="1F619E"/>
-          </w:tcPr>
-          <w:p>
-            <w:r>
-              <w:rPr>
-                <w:b/>
-                <w:color w:val="FFFFFF"/>
-                <w:sz w:val="22"/>
-              </w:rPr>
-              <w:t>Ý nghĩa</w:t>
-            </w:r>
-          </w:p>
-        </w:tc>
-        <w:tc>
-          <w:tcPr>
-            <w:tcW w:type="dxa" w:w="3024"/>
-            <w:shd w:val="clear" w:color="auto" w:fill="1F619E"/>
-          </w:tcPr>
-          <w:p>
-            <w:r>
-              <w:rPr>
-                <w:b/>
-                <w:color w:val="FFFFFF"/>
-                <w:sz w:val="22"/>
-              </w:rPr>
-              <w:t>Giá trị theo luật</w:t>
-            </w:r>
-          </w:p>
-        </w:tc>
-      </w:tr>
-      <w:tr>
-        <w:tc>
-          <w:tcPr>
-            <w:tcW w:type="dxa" w:w="3024"/>
-          </w:tcPr>
-          <w:p>
-            <w:r>
-              <w:rPr>
-                <w:sz w:val="22"/>
-              </w:rPr>
-              <w:t>$H_{basic,i}$</w:t>
-            </w:r>
-          </w:p>
-        </w:tc>
-        <w:tc>
-          <w:tcPr>
-            <w:tcW w:type="dxa" w:w="3024"/>
-          </w:tcPr>
-          <w:p>
-            <w:r>
-              <w:rPr>
-                <w:sz w:val="22"/>
-              </w:rPr>
-              <w:t>Giờ hành chính tiêu chuẩn</w:t>
-            </w:r>
-          </w:p>
-        </w:tc>
-        <w:tc>
-          <w:tcPr>
-            <w:tcW w:type="dxa" w:w="3024"/>
-          </w:tcPr>
-          <w:p>
-            <w:r>
-              <w:rPr>
-                <w:sz w:val="22"/>
-              </w:rPr>
-              <w:t>≤ 8h/ngày, ≤ 48h/tuần</w:t>
-            </w:r>
-          </w:p>
-        </w:tc>
-      </w:tr>
-      <w:tr>
-        <w:tc>
-          <w:tcPr>
-            <w:tcW w:type="dxa" w:w="3024"/>
-            <w:shd w:val="clear" w:color="auto" w:fill="EBF4FB"/>
-          </w:tcPr>
-          <w:p>
-            <w:r>
-              <w:rPr>
-                <w:sz w:val="22"/>
-              </w:rPr>
-              <w:t>$R$</w:t>
-            </w:r>
-          </w:p>
-        </w:tc>
-        <w:tc>
-          <w:tcPr>
-            <w:tcW w:type="dxa" w:w="3024"/>
-            <w:shd w:val="clear" w:color="auto" w:fill="EBF4FB"/>
-          </w:tcPr>
-          <w:p>
-            <w:r>
-              <w:rPr>
-                <w:sz w:val="22"/>
-              </w:rPr>
-              <w:t>Lương cơ bản theo giờ</w:t>
-            </w:r>
-          </w:p>
-        </w:tc>
-        <w:tc>
-          <w:tcPr>
-            <w:tcW w:type="dxa" w:w="3024"/>
-            <w:shd w:val="clear" w:color="auto" w:fill="EBF4FB"/>
-          </w:tcPr>
-          <w:p>
-            <w:r>
-              <w:rPr>
-                <w:sz w:val="22"/>
-              </w:rPr>
-              <w:t>≥ 22.500 đ/giờ (Vùng I, 2024)</w:t>
-            </w:r>
-          </w:p>
-        </w:tc>
-      </w:tr>
-      <w:tr>
-        <w:tc>
-          <w:tcPr>
-            <w:tcW w:type="dxa" w:w="3024"/>
-          </w:tcPr>
-          <w:p>
-            <w:r>
-              <w:rPr>
-                <w:sz w:val="22"/>
-              </w:rPr>
-              <w:t>$H_{OT,j}$</w:t>
-            </w:r>
-          </w:p>
-        </w:tc>
-        <w:tc>
-          <w:tcPr>
-            <w:tcW w:type="dxa" w:w="3024"/>
-          </w:tcPr>
-          <w:p>
-            <w:r>
-              <w:rPr>
-                <w:sz w:val="22"/>
-              </w:rPr>
-              <w:t>Giờ làm thêm (tăng ca)</w:t>
-            </w:r>
-          </w:p>
-        </w:tc>
-        <w:tc>
-          <w:tcPr>
-            <w:tcW w:type="dxa" w:w="3024"/>
-          </w:tcPr>
-          <w:p>
-            <w:r>
-              <w:rPr>
-                <w:sz w:val="22"/>
-              </w:rPr>
-              <w:t>≤ 40h/tháng, ≤ 200h/năm</w:t>
-            </w:r>
-          </w:p>
-        </w:tc>
-      </w:tr>
-      <w:tr>
-        <w:tc>
-          <w:tcPr>
-            <w:tcW w:type="dxa" w:w="3024"/>
-            <w:shd w:val="clear" w:color="auto" w:fill="EBF4FB"/>
-          </w:tcPr>
-          <w:p>
-            <w:r>
-              <w:rPr>
-                <w:sz w:val="22"/>
-              </w:rPr>
-              <w:t>$M_j$</w:t>
-            </w:r>
-          </w:p>
-        </w:tc>
-        <w:tc>
-          <w:tcPr>
-            <w:tcW w:type="dxa" w:w="3024"/>
-            <w:shd w:val="clear" w:color="auto" w:fill="EBF4FB"/>
-          </w:tcPr>
-          <w:p>
-            <w:r>
-              <w:rPr>
-                <w:sz w:val="22"/>
-              </w:rPr>
-              <w:t>Hệ số tăng ca</w:t>
-            </w:r>
-          </w:p>
-        </w:tc>
-        <w:tc>
-          <w:tcPr>
-            <w:tcW w:type="dxa" w:w="3024"/>
-            <w:shd w:val="clear" w:color="auto" w:fill="EBF4FB"/>
-          </w:tcPr>
-          <w:p>
-            <w:r>
-              <w:rPr>
-                <w:sz w:val="22"/>
-              </w:rPr>
-              <w:t>1.5 (ngày thường) / 2.0 (ngày nghỉ) / 3.0 (Lễ, Tết)</w:t>
-            </w:r>
-          </w:p>
-        </w:tc>
-      </w:tr>
-      <w:tr>
-        <w:tc>
-          <w:tcPr>
-            <w:tcW w:type="dxa" w:w="3024"/>
-          </w:tcPr>
-          <w:p>
-            <w:r>
-              <w:rPr>
-                <w:sz w:val="22"/>
-              </w:rPr>
-              <w:t>$H_{night,k}$</w:t>
-            </w:r>
-          </w:p>
-        </w:tc>
-        <w:tc>
-          <w:tcPr>
-            <w:tcW w:type="dxa" w:w="3024"/>
-          </w:tcPr>
-          <w:p>
-            <w:r>
-              <w:rPr>
-                <w:sz w:val="22"/>
-              </w:rPr>
-              <w:t>Giờ làm ca đêm (22:00–06:00)</w:t>
-            </w:r>
-          </w:p>
-        </w:tc>
-        <w:tc>
-          <w:tcPr>
-            <w:tcW w:type="dxa" w:w="3024"/>
-          </w:tcPr>
-          <w:p>
-            <w:r>
-              <w:rPr>
-                <w:sz w:val="22"/>
-              </w:rPr>
-              <w:t>Theo lịch thực tế</w:t>
-            </w:r>
-          </w:p>
-        </w:tc>
-      </w:tr>
-      <w:tr>
-        <w:tc>
-          <w:tcPr>
-            <w:tcW w:type="dxa" w:w="3024"/>
-            <w:shd w:val="clear" w:color="auto" w:fill="EBF4FB"/>
-          </w:tcPr>
-          <w:p>
-            <w:r>
-              <w:rPr>
-                <w:sz w:val="22"/>
-              </w:rPr>
-              <w:t>$N_k$</w:t>
-            </w:r>
-          </w:p>
-        </w:tc>
-        <w:tc>
-          <w:tcPr>
-            <w:tcW w:type="dxa" w:w="3024"/>
-            <w:shd w:val="clear" w:color="auto" w:fill="EBF4FB"/>
-          </w:tcPr>
-          <w:p>
-            <w:r>
-              <w:rPr>
-                <w:sz w:val="22"/>
-              </w:rPr>
-              <w:t>Hệ số phụ cấp đêm</w:t>
-            </w:r>
-          </w:p>
-        </w:tc>
-        <w:tc>
-          <w:tcPr>
-            <w:tcW w:type="dxa" w:w="3024"/>
-            <w:shd w:val="clear" w:color="auto" w:fill="EBF4FB"/>
-          </w:tcPr>
-          <w:p>
-            <w:r>
-              <w:rPr>
-                <w:sz w:val="22"/>
-              </w:rPr>
-              <w:t>+30% (≥ 1.3); nếu vừa tăng ca vừa đêm → cộng thêm +20%</w:t>
-            </w:r>
-          </w:p>
-        </w:tc>
-      </w:tr>
-      <w:tr>
-        <w:tc>
-          <w:tcPr>
-            <w:tcW w:type="dxa" w:w="3024"/>
-          </w:tcPr>
-          <w:p>
-            <w:r>
-              <w:rPr>
-                <w:sz w:val="22"/>
-              </w:rPr>
-              <w:t>$A_{total}$</w:t>
-            </w:r>
-          </w:p>
-        </w:tc>
-        <w:tc>
-          <w:tcPr>
-            <w:tcW w:type="dxa" w:w="3024"/>
-          </w:tcPr>
-          <w:p>
-            <w:r>
-              <w:rPr>
-                <w:sz w:val="22"/>
-              </w:rPr>
-              <w:t>Tổng phụ cấp (ăn ca, xăng xe...)</w:t>
-            </w:r>
-          </w:p>
-        </w:tc>
-        <w:tc>
-          <w:tcPr>
-            <w:tcW w:type="dxa" w:w="3024"/>
-          </w:tcPr>
-          <w:p>
-            <w:r>
-              <w:rPr>
-                <w:sz w:val="22"/>
-              </w:rPr>
-              <w:t>Theo chính sách quán</w:t>
-            </w:r>
-          </w:p>
-        </w:tc>
-      </w:tr>
-      <w:tr>
-        <w:tc>
-          <w:tcPr>
-            <w:tcW w:type="dxa" w:w="3024"/>
-            <w:shd w:val="clear" w:color="auto" w:fill="EBF4FB"/>
-          </w:tcPr>
-          <w:p>
-            <w:r>
-              <w:rPr>
-                <w:sz w:val="22"/>
-              </w:rPr>
-              <w:t>$D_{total}$</w:t>
-            </w:r>
-          </w:p>
-        </w:tc>
-        <w:tc>
-          <w:tcPr>
-            <w:tcW w:type="dxa" w:w="3024"/>
-            <w:shd w:val="clear" w:color="auto" w:fill="EBF4FB"/>
-          </w:tcPr>
-          <w:p>
-            <w:r>
-              <w:rPr>
-                <w:sz w:val="22"/>
-              </w:rPr>
-              <w:t>Tổng khấu trừ (BHXH, đi muộn...)</w:t>
-            </w:r>
-          </w:p>
-        </w:tc>
-        <w:tc>
-          <w:tcPr>
-            <w:tcW w:type="dxa" w:w="3024"/>
-            <w:shd w:val="clear" w:color="auto" w:fill="EBF4FB"/>
-          </w:tcPr>
-          <w:p>
-            <w:r>
-              <w:rPr>
-                <w:sz w:val="22"/>
-              </w:rPr>
-              <w:t>Theo chính sách + pháp luật</w:t>
-            </w:r>
-          </w:p>
-        </w:tc>
-      </w:tr>
-    </w:tbl>
-    <w:p/>
-    <w:p/>
-    <w:p>
-      <w:pPr>
-        <w:spacing w:after="80"/>
-      </w:pPr>
+        <w:t>120.000đ/ca</w:t>
+      </w:r>
+      <w:r>
+        <w:t xml:space="preserve">, phần lương là </w:t>
+      </w:r>
       <w:r>
         <w:rPr>
-          <w:b/>
+          <w:rFonts w:ascii="Courier New" w:hAnsi="Courier New"/>
+          <w:color w:val="C7254E"/>
+          <w:sz w:val="18"/>
         </w:rPr>
-        <w:t>Kiến trúc tách biệt hệ số khỏi mã nguồn:</w:t>
-      </w:r>
-    </w:p>
-    <w:p/>
-    <w:p>
-      <w:pPr>
-        <w:ind w:left="567"/>
-      </w:pPr>
+        <w:t>2.160.000đ</w:t>
+      </w:r>
+    </w:p>
+    <w:p>
+      <w:pPr>
+        <w:pStyle w:val="ListBullet"/>
+        <w:ind w:left="0"/>
+      </w:pPr>
+      <w:r>
+        <w:t xml:space="preserve">Nếu cùng kỳ hoàn thành </w:t>
+      </w:r>
       <w:r>
         <w:rPr>
-          <w:i/>
-          <w:color w:val="555555"/>
+          <w:rFonts w:ascii="Courier New" w:hAnsi="Courier New"/>
+          <w:color w:val="C7254E"/>
+          <w:sz w:val="18"/>
         </w:rPr>
-        <w:t>Mọi hệ số $M_j$ và $N_k$ được lưu trong **Bảng ma trận cấu hình (Compliance Matrix)** riêng biệt trong CSDL, không hardcode vào logic code. Khi Chính phủ ban hành quy định mới, Nhân sự chỉ cần cập nhật bảng cấu hình mà **không cần phát hành phiên bản phần mềm mới**.</w:t>
-      </w:r>
-    </w:p>
-    <w:p/>
-    <w:tbl>
-      <w:tblPr>
-        <w:tblStyle w:val="TableGrid"/>
-        <w:tblW w:type="auto" w:w="0"/>
-        <w:tblLook w:firstColumn="1" w:firstRow="1" w:lastColumn="0" w:lastRow="0" w:noHBand="0" w:noVBand="1" w:val="04A0"/>
-      </w:tblPr>
-      <w:tblGrid>
-        <w:gridCol w:w="4535"/>
-        <w:gridCol w:w="4535"/>
-      </w:tblGrid>
-      <w:tr>
-        <w:tc>
-          <w:tcPr>
-            <w:tcW w:type="dxa" w:w="4535"/>
-            <w:shd w:val="clear" w:color="auto" w:fill="1F619E"/>
-          </w:tcPr>
-          <w:p>
-            <w:r>
-              <w:rPr>
-                <w:b/>
-                <w:color w:val="FFFFFF"/>
-                <w:sz w:val="22"/>
-              </w:rPr>
-              <w:t>Bảng</w:t>
-            </w:r>
-          </w:p>
-        </w:tc>
-        <w:tc>
-          <w:tcPr>
-            <w:tcW w:type="dxa" w:w="4535"/>
-            <w:shd w:val="clear" w:color="auto" w:fill="1F619E"/>
-          </w:tcPr>
-          <w:p>
-            <w:r>
-              <w:rPr>
-                <w:b/>
-                <w:color w:val="FFFFFF"/>
-                <w:sz w:val="22"/>
-              </w:rPr>
-              <w:t>compliance_matrix</w:t>
-            </w:r>
-          </w:p>
-        </w:tc>
-      </w:tr>
-      <w:tr>
-        <w:tc>
-          <w:tcPr>
-            <w:tcW w:type="dxa" w:w="4535"/>
-          </w:tcPr>
-          <w:p>
-            <w:r>
-              <w:rPr>
-                <w:sz w:val="22"/>
-              </w:rPr>
-              <w:t>loai_ca</w:t>
-            </w:r>
-          </w:p>
-        </w:tc>
-        <w:tc>
-          <w:tcPr>
-            <w:tcW w:type="dxa" w:w="4535"/>
-          </w:tcPr>
-          <w:p>
-            <w:r>
-              <w:rPr>
-                <w:sz w:val="22"/>
-              </w:rPr>
-              <w:t>ENUM: 'ngay_thuong', 'ngay_nghi', 'le_tet', 'ca_dem'</w:t>
-            </w:r>
-          </w:p>
-        </w:tc>
-      </w:tr>
-      <w:tr>
-        <w:tc>
-          <w:tcPr>
-            <w:tcW w:type="dxa" w:w="4535"/>
-            <w:shd w:val="clear" w:color="auto" w:fill="EBF4FB"/>
-          </w:tcPr>
-          <w:p>
-            <w:r>
-              <w:rPr>
-                <w:sz w:val="22"/>
-              </w:rPr>
-              <w:t>he_so</w:t>
-            </w:r>
-          </w:p>
-        </w:tc>
-        <w:tc>
-          <w:tcPr>
-            <w:tcW w:type="dxa" w:w="4535"/>
-            <w:shd w:val="clear" w:color="auto" w:fill="EBF4FB"/>
-          </w:tcPr>
-          <w:p>
-            <w:r>
-              <w:rPr>
-                <w:sz w:val="22"/>
-              </w:rPr>
-              <w:t>DECIMAL(4,2) — hệ số áp dụng</w:t>
-            </w:r>
-          </w:p>
-        </w:tc>
-      </w:tr>
-      <w:tr>
-        <w:tc>
-          <w:tcPr>
-            <w:tcW w:type="dxa" w:w="4535"/>
-          </w:tcPr>
-          <w:p>
-            <w:r>
-              <w:rPr>
-                <w:sz w:val="22"/>
-              </w:rPr>
-              <w:t>hieu_luc_tu</w:t>
-            </w:r>
-          </w:p>
-        </w:tc>
-        <w:tc>
-          <w:tcPr>
-            <w:tcW w:type="dxa" w:w="4535"/>
-          </w:tcPr>
-          <w:p>
-            <w:r>
-              <w:rPr>
-                <w:sz w:val="22"/>
-              </w:rPr>
-              <w:t>DATE — ngày bắt đầu hiệu lực</w:t>
-            </w:r>
-          </w:p>
-        </w:tc>
-      </w:tr>
-      <w:tr>
-        <w:tc>
-          <w:tcPr>
-            <w:tcW w:type="dxa" w:w="4535"/>
-            <w:shd w:val="clear" w:color="auto" w:fill="EBF4FB"/>
-          </w:tcPr>
-          <w:p>
-            <w:r>
-              <w:rPr>
-                <w:sz w:val="22"/>
-              </w:rPr>
-              <w:t>van_ban_phap_ly</w:t>
-            </w:r>
-          </w:p>
-        </w:tc>
-        <w:tc>
-          <w:tcPr>
-            <w:tcW w:type="dxa" w:w="4535"/>
-            <w:shd w:val="clear" w:color="auto" w:fill="EBF4FB"/>
-          </w:tcPr>
-          <w:p>
-            <w:r>
-              <w:rPr>
-                <w:sz w:val="22"/>
-              </w:rPr>
-              <w:t>VARCHAR — số nghị định tham chiếu</w:t>
-            </w:r>
-          </w:p>
-        </w:tc>
-      </w:tr>
-    </w:tbl>
-    <w:p/>
+        <w:t>8</w:t>
+      </w:r>
+      <w:r>
+        <w:t xml:space="preserve"> ca tối ngày thường với mức </w:t>
+      </w:r>
+      <w:r>
+        <w:rPr>
+          <w:rFonts w:ascii="Courier New" w:hAnsi="Courier New"/>
+          <w:color w:val="C7254E"/>
+          <w:sz w:val="18"/>
+        </w:rPr>
+        <w:t>140.000đ/ca</w:t>
+      </w:r>
+      <w:r>
+        <w:t xml:space="preserve">, phần lương là </w:t>
+      </w:r>
+      <w:r>
+        <w:rPr>
+          <w:rFonts w:ascii="Courier New" w:hAnsi="Courier New"/>
+          <w:color w:val="C7254E"/>
+          <w:sz w:val="18"/>
+        </w:rPr>
+        <w:t>1.120.000đ</w:t>
+      </w:r>
+    </w:p>
+    <w:p>
+      <w:pPr>
+        <w:pStyle w:val="ListBullet"/>
+        <w:ind w:left="0"/>
+      </w:pPr>
+      <w:r>
+        <w:t xml:space="preserve">Nếu có thêm </w:t>
+      </w:r>
+      <w:r>
+        <w:rPr>
+          <w:rFonts w:ascii="Courier New" w:hAnsi="Courier New"/>
+          <w:color w:val="C7254E"/>
+          <w:sz w:val="18"/>
+        </w:rPr>
+        <w:t>2</w:t>
+      </w:r>
+      <w:r>
+        <w:t xml:space="preserve"> ca cuối tuần loại tối, phần tăng là </w:t>
+      </w:r>
+      <w:r>
+        <w:rPr>
+          <w:rFonts w:ascii="Courier New" w:hAnsi="Courier New"/>
+          <w:color w:val="C7254E"/>
+          <w:sz w:val="18"/>
+        </w:rPr>
+        <w:t>2 × 140.000 × 1.5 = 420.000đ</w:t>
+      </w:r>
+    </w:p>
+    <w:p>
+      <w:pPr>
+        <w:pStyle w:val="ListBullet"/>
+        <w:ind w:left="0"/>
+      </w:pPr>
+      <w:r>
+        <w:t xml:space="preserve">Nếu có </w:t>
+      </w:r>
+      <w:r>
+        <w:rPr>
+          <w:rFonts w:ascii="Courier New" w:hAnsi="Courier New"/>
+          <w:color w:val="C7254E"/>
+          <w:sz w:val="18"/>
+        </w:rPr>
+        <w:t>1</w:t>
+      </w:r>
+      <w:r>
+        <w:t xml:space="preserve"> ca ngày lễ loại sáng, phần tăng là </w:t>
+      </w:r>
+      <w:r>
+        <w:rPr>
+          <w:rFonts w:ascii="Courier New" w:hAnsi="Courier New"/>
+          <w:color w:val="C7254E"/>
+          <w:sz w:val="18"/>
+        </w:rPr>
+        <w:t>1 × 120.000 × 2.0 = 240.000đ</w:t>
+      </w:r>
+    </w:p>
+    <w:p>
+      <w:pPr>
+        <w:pStyle w:val="ListBullet"/>
+        <w:ind w:left="0"/>
+      </w:pPr>
+      <w:r>
+        <w:t xml:space="preserve">Tổng lương kỳ đó là </w:t>
+      </w:r>
+      <w:r>
+        <w:rPr>
+          <w:rFonts w:ascii="Courier New" w:hAnsi="Courier New"/>
+          <w:color w:val="C7254E"/>
+          <w:sz w:val="18"/>
+        </w:rPr>
+        <w:t>3.940.000đ</w:t>
+      </w:r>
+    </w:p>
     <w:p/>
     <w:p>
       <w:pPr>
@@ -14495,20 +14085,20 @@
               <w:rPr>
                 <w:sz w:val="22"/>
               </w:rPr>
-              <w:t>so_gio_lam không được tính nếu check_out_time IS NULL</w:t>
-            </w:r>
-          </w:p>
-        </w:tc>
-        <w:tc>
-          <w:tcPr>
-            <w:tcW w:type="dxa" w:w="3024"/>
-          </w:tcPr>
-          <w:p>
-            <w:r>
-              <w:rPr>
-                <w:sz w:val="22"/>
-              </w:rPr>
-              <w:t>Dùng CASE WHEN trong câu truy vấn tính lương</w:t>
+              <w:t>Chỉ ca có đủ check_in_time và check_out_time mới được đưa vào bảng lương</w:t>
+            </w:r>
+          </w:p>
+        </w:tc>
+        <w:tc>
+          <w:tcPr>
+            <w:tcW w:type="dxa" w:w="3024"/>
+          </w:tcPr>
+          <w:p>
+            <w:r>
+              <w:rPr>
+                <w:sz w:val="22"/>
+              </w:rPr>
+              <w:t>Dùng CASE WHEN hoặc cờ trạng thái hợp lệ khi tổng hợp lương</w:t>
             </w:r>
           </w:p>
         </w:tc>
@@ -14580,20 +14170,20 @@
               <w:rPr>
                 <w:sz w:val="22"/>
               </w:rPr>
-              <w:t>Ca cuối tuần (Thứ 7, Chủ nhật) được nhân hệ số 1.5</w:t>
-            </w:r>
-          </w:p>
-        </w:tc>
-        <w:tc>
-          <w:tcPr>
-            <w:tcW w:type="dxa" w:w="3024"/>
-          </w:tcPr>
-          <w:p>
-            <w:r>
-              <w:rPr>
-                <w:sz w:val="22"/>
-              </w:rPr>
-              <w:t>Hàm tính lương kiểm tra DAYOFWEEK(ngay_lam_viec) trước khi áp đơn giá</w:t>
+              <w:t>Mỗi ca phải thuộc đúng 1 trong 2 loại: sang hoặc toi; nếu rơi vào cuối tuần/ngày lễ thì áp đúng hệ số</w:t>
+            </w:r>
+          </w:p>
+        </w:tc>
+        <w:tc>
+          <w:tcPr>
+            <w:tcW w:type="dxa" w:w="3024"/>
+          </w:tcPr>
+          <w:p>
+            <w:r>
+              <w:rPr>
+                <w:sz w:val="22"/>
+              </w:rPr>
+              <w:t>Ràng buộc ENUM / validation ngày làm việc và cờ loại ngày</w:t>
             </w:r>
           </w:p>
         </w:tc>
@@ -14788,20 +14378,20 @@
               <w:rPr>
                 <w:sz w:val="22"/>
               </w:rPr>
-              <w:t>so_gio_lam không được tính nếu check_out_time IS NULL</w:t>
-            </w:r>
-          </w:p>
-        </w:tc>
-        <w:tc>
-          <w:tcPr>
-            <w:tcW w:type="dxa" w:w="3024"/>
-          </w:tcPr>
-          <w:p>
-            <w:r>
-              <w:rPr>
-                <w:sz w:val="22"/>
-              </w:rPr>
-              <w:t>Dùng CASE WHEN trong câu truy vấn tính lương</w:t>
+              <w:t>Chỉ ca có đủ check_in_time và check_out_time mới được đưa vào bảng lương</w:t>
+            </w:r>
+          </w:p>
+        </w:tc>
+        <w:tc>
+          <w:tcPr>
+            <w:tcW w:type="dxa" w:w="3024"/>
+          </w:tcPr>
+          <w:p>
+            <w:r>
+              <w:rPr>
+                <w:sz w:val="22"/>
+              </w:rPr>
+              <w:t>Dùng CASE WHEN hoặc cờ trạng thái hợp lệ khi tổng hợp lương</w:t>
             </w:r>
           </w:p>
         </w:tc>
@@ -14873,20 +14463,20 @@
               <w:rPr>
                 <w:sz w:val="22"/>
               </w:rPr>
-              <w:t>Ca cuối tuần (Thứ 7, Chủ nhật) được nhân hệ số 1.5</w:t>
-            </w:r>
-          </w:p>
-        </w:tc>
-        <w:tc>
-          <w:tcPr>
-            <w:tcW w:type="dxa" w:w="3024"/>
-          </w:tcPr>
-          <w:p>
-            <w:r>
-              <w:rPr>
-                <w:sz w:val="22"/>
-              </w:rPr>
-              <w:t>Hàm tính lương kiểm tra DAYOFWEEK(ngay_lam_viec) trước khi áp đơn giá</w:t>
+              <w:t>Mỗi ca phải thuộc đúng 1 trong 2 loại: sang hoặc toi; nếu rơi vào cuối tuần/ngày lễ thì áp đúng hệ số</w:t>
+            </w:r>
+          </w:p>
+        </w:tc>
+        <w:tc>
+          <w:tcPr>
+            <w:tcW w:type="dxa" w:w="3024"/>
+          </w:tcPr>
+          <w:p>
+            <w:r>
+              <w:rPr>
+                <w:sz w:val="22"/>
+              </w:rPr>
+              <w:t>Ràng buộc ENUM / validation ngày làm việc và cờ loại ngày</w:t>
             </w:r>
           </w:p>
         </w:tc>
@@ -15612,7 +15202,7 @@
           <w:i/>
           <w:color w:val="555555"/>
         </w:rPr>
-        <w:t>**Trái tim của báo cáo — Chiếm ~50%.** Đặc tả đầy đủ nghiệp vụ UC04 do **Nguyễn Viết Tùng** phụ trách: phân công ca, check-in/out sinh trắc học, tính lương đa biến NĐ38 và phân quyền RBAC.</w:t>
+        <w:t>**Trái tim của báo cáo — Chiếm ~50%.** Đặc tả đầy đủ nghiệp vụ UC04 do **Nguyễn Viết Tùng** phụ trách: phân công ca, check-in/out sinh trắc học, tính lương đơn giản theo 2 ca sáng/tối và phân quyền RBAC.</w:t>
       </w:r>
     </w:p>
     <w:p/>
@@ -18995,7 +18585,7 @@
         <w:rPr>
           <w:b/>
         </w:rPr>
-        <w:t>Công thức tính lương:</w:t>
+        <w:t>Công thức tính lương đơn giản:</w:t>
       </w:r>
     </w:p>
     <w:p/>
@@ -19008,7 +18598,7 @@
           <w:rFonts w:ascii="Cambria Math" w:hAnsi="Cambria Math"/>
           <w:sz w:val="24"/>
         </w:rPr>
-        <w:t>$$L_{nv} = \sum_{i=1}^{n} \left[ (t_{checkout_i} - t_{checkin_i}) \times r_{ca_i} \right] - P_{tre} + B_{bonus}$$</w:t>
+        <w:t>$$L_{nv} = (N_{sang} \times R_{sang}) + (N_{toi} \times R_{toi})$$</w:t>
       </w:r>
     </w:p>
     <w:p/>
@@ -19036,7 +18626,7 @@
         <w:ind w:left="0"/>
       </w:pPr>
       <w:r>
-        <w:t>$t_{checkout_i} - t_{checkin_i}$: Số giờ làm thực tế của ca $i$ (tính bằng giờ, làm tròn 2 chữ số thập phân)</w:t>
+        <w:t>$N_{sang}$: Số ca sáng đã hoàn thành trong kỳ</w:t>
       </w:r>
     </w:p>
     <w:p>
@@ -19045,7 +18635,7 @@
         <w:ind w:left="0"/>
       </w:pPr>
       <w:r>
-        <w:t>$r_{ca_i}$: Đơn giá giờ của ca $i$ (có thể khác nhau giữa ca thường và ca cuối tuần/lễ)</w:t>
+        <w:t>$N_{toi}$: Số ca tối đã hoàn thành trong kỳ</w:t>
       </w:r>
     </w:p>
     <w:p>
@@ -19054,7 +18644,7 @@
         <w:ind w:left="0"/>
       </w:pPr>
       <w:r>
-        <w:t>$P_{tre}$: Khoản khấu trừ do đi muộn (nếu có, theo chính sách)</w:t>
+        <w:t>$R_{sang}$: Mức lương cố định cho một ca sáng</w:t>
       </w:r>
     </w:p>
     <w:p>
@@ -19063,7 +18653,7 @@
         <w:ind w:left="0"/>
       </w:pPr>
       <w:r>
-        <w:t>$B_{bonus}$: Thưởng thêm (nếu Quản lý nhập thủ công)</w:t>
+        <w:t>$R_{toi}$: Mức lương cố định cho một ca tối</w:t>
       </w:r>
     </w:p>
     <w:p/>
@@ -19814,635 +19404,18 @@
         <w:spacing w:after="80"/>
       </w:pPr>
       <w:r>
-        <w:t xml:space="preserve">Hệ thống loại bỏ công thức tính lương đơn giản và triển khai </w:t>
+        <w:t xml:space="preserve">Hệ thống áp dụng </w:t>
       </w:r>
       <w:r>
         <w:rPr>
           <w:b/>
         </w:rPr>
-        <w:t>động cơ tính lương đa biến</w:t>
-      </w:r>
-      <w:r>
-        <w:t xml:space="preserve"> tuân thủ đầy đủ pháp luật lao động Việt Nam:</w:t>
-      </w:r>
-    </w:p>
-    <w:p/>
-    <w:p>
-      <w:pPr>
-        <w:jc w:val="center"/>
-      </w:pPr>
-      <w:r>
-        <w:rPr>
-          <w:rFonts w:ascii="Cambria Math" w:hAnsi="Cambria Math"/>
-          <w:sz w:val="24"/>
-        </w:rPr>
-        <w:t>$$S_{total} = \sum_{i=1}^{n} \left( H_{basic,i} \times R \right) + \sum_{j=1}^{m} \left( H_{OT,j} \times R \times M_j \right) + \sum_{k=1}^{p} \left( H_{night,k} \times R \times N_k \right) + A_{total} - D_{total}$$</w:t>
-      </w:r>
-    </w:p>
-    <w:p/>
-    <w:p>
-      <w:pPr>
-        <w:spacing w:after="80"/>
-      </w:pPr>
-      <w:r>
-        <w:rPr>
-          <w:b/>
-        </w:rPr>
-        <w:t>Giải thích các biến số:</w:t>
-      </w:r>
-    </w:p>
-    <w:p/>
-    <w:tbl>
-      <w:tblPr>
-        <w:tblStyle w:val="TableGrid"/>
-        <w:tblW w:type="auto" w:w="0"/>
-        <w:tblLook w:firstColumn="1" w:firstRow="1" w:lastColumn="0" w:lastRow="0" w:noHBand="0" w:noVBand="1" w:val="04A0"/>
-      </w:tblPr>
-      <w:tblGrid>
-        <w:gridCol w:w="3024"/>
-        <w:gridCol w:w="3024"/>
-        <w:gridCol w:w="3024"/>
-      </w:tblGrid>
-      <w:tr>
-        <w:tc>
-          <w:tcPr>
-            <w:tcW w:type="dxa" w:w="3024"/>
-            <w:shd w:val="clear" w:color="auto" w:fill="1F619E"/>
-          </w:tcPr>
-          <w:p>
-            <w:r>
-              <w:rPr>
-                <w:b/>
-                <w:color w:val="FFFFFF"/>
-                <w:sz w:val="22"/>
-              </w:rPr>
-              <w:t>Biến</w:t>
-            </w:r>
-          </w:p>
-        </w:tc>
-        <w:tc>
-          <w:tcPr>
-            <w:tcW w:type="dxa" w:w="3024"/>
-            <w:shd w:val="clear" w:color="auto" w:fill="1F619E"/>
-          </w:tcPr>
-          <w:p>
-            <w:r>
-              <w:rPr>
-                <w:b/>
-                <w:color w:val="FFFFFF"/>
-                <w:sz w:val="22"/>
-              </w:rPr>
-              <w:t>Ý nghĩa</w:t>
-            </w:r>
-          </w:p>
-        </w:tc>
-        <w:tc>
-          <w:tcPr>
-            <w:tcW w:type="dxa" w:w="3024"/>
-            <w:shd w:val="clear" w:color="auto" w:fill="1F619E"/>
-          </w:tcPr>
-          <w:p>
-            <w:r>
-              <w:rPr>
-                <w:b/>
-                <w:color w:val="FFFFFF"/>
-                <w:sz w:val="22"/>
-              </w:rPr>
-              <w:t>Giá trị theo luật</w:t>
-            </w:r>
-          </w:p>
-        </w:tc>
-      </w:tr>
-      <w:tr>
-        <w:tc>
-          <w:tcPr>
-            <w:tcW w:type="dxa" w:w="3024"/>
-          </w:tcPr>
-          <w:p>
-            <w:r>
-              <w:rPr>
-                <w:sz w:val="22"/>
-              </w:rPr>
-              <w:t>$H_{basic,i}$</w:t>
-            </w:r>
-          </w:p>
-        </w:tc>
-        <w:tc>
-          <w:tcPr>
-            <w:tcW w:type="dxa" w:w="3024"/>
-          </w:tcPr>
-          <w:p>
-            <w:r>
-              <w:rPr>
-                <w:sz w:val="22"/>
-              </w:rPr>
-              <w:t>Giờ hành chính tiêu chuẩn</w:t>
-            </w:r>
-          </w:p>
-        </w:tc>
-        <w:tc>
-          <w:tcPr>
-            <w:tcW w:type="dxa" w:w="3024"/>
-          </w:tcPr>
-          <w:p>
-            <w:r>
-              <w:rPr>
-                <w:sz w:val="22"/>
-              </w:rPr>
-              <w:t>≤ 8h/ngày, ≤ 48h/tuần</w:t>
-            </w:r>
-          </w:p>
-        </w:tc>
-      </w:tr>
-      <w:tr>
-        <w:tc>
-          <w:tcPr>
-            <w:tcW w:type="dxa" w:w="3024"/>
-            <w:shd w:val="clear" w:color="auto" w:fill="EBF4FB"/>
-          </w:tcPr>
-          <w:p>
-            <w:r>
-              <w:rPr>
-                <w:sz w:val="22"/>
-              </w:rPr>
-              <w:t>$R$</w:t>
-            </w:r>
-          </w:p>
-        </w:tc>
-        <w:tc>
-          <w:tcPr>
-            <w:tcW w:type="dxa" w:w="3024"/>
-            <w:shd w:val="clear" w:color="auto" w:fill="EBF4FB"/>
-          </w:tcPr>
-          <w:p>
-            <w:r>
-              <w:rPr>
-                <w:sz w:val="22"/>
-              </w:rPr>
-              <w:t>Lương cơ bản theo giờ</w:t>
-            </w:r>
-          </w:p>
-        </w:tc>
-        <w:tc>
-          <w:tcPr>
-            <w:tcW w:type="dxa" w:w="3024"/>
-            <w:shd w:val="clear" w:color="auto" w:fill="EBF4FB"/>
-          </w:tcPr>
-          <w:p>
-            <w:r>
-              <w:rPr>
-                <w:sz w:val="22"/>
-              </w:rPr>
-              <w:t>≥ 22.500 đ/giờ (Vùng I, 2024)</w:t>
-            </w:r>
-          </w:p>
-        </w:tc>
-      </w:tr>
-      <w:tr>
-        <w:tc>
-          <w:tcPr>
-            <w:tcW w:type="dxa" w:w="3024"/>
-          </w:tcPr>
-          <w:p>
-            <w:r>
-              <w:rPr>
-                <w:sz w:val="22"/>
-              </w:rPr>
-              <w:t>$H_{OT,j}$</w:t>
-            </w:r>
-          </w:p>
-        </w:tc>
-        <w:tc>
-          <w:tcPr>
-            <w:tcW w:type="dxa" w:w="3024"/>
-          </w:tcPr>
-          <w:p>
-            <w:r>
-              <w:rPr>
-                <w:sz w:val="22"/>
-              </w:rPr>
-              <w:t>Giờ làm thêm (tăng ca)</w:t>
-            </w:r>
-          </w:p>
-        </w:tc>
-        <w:tc>
-          <w:tcPr>
-            <w:tcW w:type="dxa" w:w="3024"/>
-          </w:tcPr>
-          <w:p>
-            <w:r>
-              <w:rPr>
-                <w:sz w:val="22"/>
-              </w:rPr>
-              <w:t>≤ 40h/tháng, ≤ 200h/năm</w:t>
-            </w:r>
-          </w:p>
-        </w:tc>
-      </w:tr>
-      <w:tr>
-        <w:tc>
-          <w:tcPr>
-            <w:tcW w:type="dxa" w:w="3024"/>
-            <w:shd w:val="clear" w:color="auto" w:fill="EBF4FB"/>
-          </w:tcPr>
-          <w:p>
-            <w:r>
-              <w:rPr>
-                <w:sz w:val="22"/>
-              </w:rPr>
-              <w:t>$M_j$</w:t>
-            </w:r>
-          </w:p>
-        </w:tc>
-        <w:tc>
-          <w:tcPr>
-            <w:tcW w:type="dxa" w:w="3024"/>
-            <w:shd w:val="clear" w:color="auto" w:fill="EBF4FB"/>
-          </w:tcPr>
-          <w:p>
-            <w:r>
-              <w:rPr>
-                <w:sz w:val="22"/>
-              </w:rPr>
-              <w:t>Hệ số tăng ca</w:t>
-            </w:r>
-          </w:p>
-        </w:tc>
-        <w:tc>
-          <w:tcPr>
-            <w:tcW w:type="dxa" w:w="3024"/>
-            <w:shd w:val="clear" w:color="auto" w:fill="EBF4FB"/>
-          </w:tcPr>
-          <w:p>
-            <w:r>
-              <w:rPr>
-                <w:sz w:val="22"/>
-              </w:rPr>
-              <w:t>1.5 (ngày thường) / 2.0 (ngày nghỉ) / 3.0 (Lễ, Tết)</w:t>
-            </w:r>
-          </w:p>
-        </w:tc>
-      </w:tr>
-      <w:tr>
-        <w:tc>
-          <w:tcPr>
-            <w:tcW w:type="dxa" w:w="3024"/>
-          </w:tcPr>
-          <w:p>
-            <w:r>
-              <w:rPr>
-                <w:sz w:val="22"/>
-              </w:rPr>
-              <w:t>$H_{night,k}$</w:t>
-            </w:r>
-          </w:p>
-        </w:tc>
-        <w:tc>
-          <w:tcPr>
-            <w:tcW w:type="dxa" w:w="3024"/>
-          </w:tcPr>
-          <w:p>
-            <w:r>
-              <w:rPr>
-                <w:sz w:val="22"/>
-              </w:rPr>
-              <w:t>Giờ làm ca đêm (22:00–06:00)</w:t>
-            </w:r>
-          </w:p>
-        </w:tc>
-        <w:tc>
-          <w:tcPr>
-            <w:tcW w:type="dxa" w:w="3024"/>
-          </w:tcPr>
-          <w:p>
-            <w:r>
-              <w:rPr>
-                <w:sz w:val="22"/>
-              </w:rPr>
-              <w:t>Theo lịch thực tế</w:t>
-            </w:r>
-          </w:p>
-        </w:tc>
-      </w:tr>
-      <w:tr>
-        <w:tc>
-          <w:tcPr>
-            <w:tcW w:type="dxa" w:w="3024"/>
-            <w:shd w:val="clear" w:color="auto" w:fill="EBF4FB"/>
-          </w:tcPr>
-          <w:p>
-            <w:r>
-              <w:rPr>
-                <w:sz w:val="22"/>
-              </w:rPr>
-              <w:t>$N_k$</w:t>
-            </w:r>
-          </w:p>
-        </w:tc>
-        <w:tc>
-          <w:tcPr>
-            <w:tcW w:type="dxa" w:w="3024"/>
-            <w:shd w:val="clear" w:color="auto" w:fill="EBF4FB"/>
-          </w:tcPr>
-          <w:p>
-            <w:r>
-              <w:rPr>
-                <w:sz w:val="22"/>
-              </w:rPr>
-              <w:t>Hệ số phụ cấp đêm</w:t>
-            </w:r>
-          </w:p>
-        </w:tc>
-        <w:tc>
-          <w:tcPr>
-            <w:tcW w:type="dxa" w:w="3024"/>
-            <w:shd w:val="clear" w:color="auto" w:fill="EBF4FB"/>
-          </w:tcPr>
-          <w:p>
-            <w:r>
-              <w:rPr>
-                <w:sz w:val="22"/>
-              </w:rPr>
-              <w:t>+30% (≥ 1.3); nếu vừa tăng ca vừa đêm → cộng thêm +20%</w:t>
-            </w:r>
-          </w:p>
-        </w:tc>
-      </w:tr>
-      <w:tr>
-        <w:tc>
-          <w:tcPr>
-            <w:tcW w:type="dxa" w:w="3024"/>
-          </w:tcPr>
-          <w:p>
-            <w:r>
-              <w:rPr>
-                <w:sz w:val="22"/>
-              </w:rPr>
-              <w:t>$A_{total}$</w:t>
-            </w:r>
-          </w:p>
-        </w:tc>
-        <w:tc>
-          <w:tcPr>
-            <w:tcW w:type="dxa" w:w="3024"/>
-          </w:tcPr>
-          <w:p>
-            <w:r>
-              <w:rPr>
-                <w:sz w:val="22"/>
-              </w:rPr>
-              <w:t>Tổng phụ cấp (ăn ca, xăng xe...)</w:t>
-            </w:r>
-          </w:p>
-        </w:tc>
-        <w:tc>
-          <w:tcPr>
-            <w:tcW w:type="dxa" w:w="3024"/>
-          </w:tcPr>
-          <w:p>
-            <w:r>
-              <w:rPr>
-                <w:sz w:val="22"/>
-              </w:rPr>
-              <w:t>Theo chính sách quán</w:t>
-            </w:r>
-          </w:p>
-        </w:tc>
-      </w:tr>
-      <w:tr>
-        <w:tc>
-          <w:tcPr>
-            <w:tcW w:type="dxa" w:w="3024"/>
-            <w:shd w:val="clear" w:color="auto" w:fill="EBF4FB"/>
-          </w:tcPr>
-          <w:p>
-            <w:r>
-              <w:rPr>
-                <w:sz w:val="22"/>
-              </w:rPr>
-              <w:t>$D_{total}$</w:t>
-            </w:r>
-          </w:p>
-        </w:tc>
-        <w:tc>
-          <w:tcPr>
-            <w:tcW w:type="dxa" w:w="3024"/>
-            <w:shd w:val="clear" w:color="auto" w:fill="EBF4FB"/>
-          </w:tcPr>
-          <w:p>
-            <w:r>
-              <w:rPr>
-                <w:sz w:val="22"/>
-              </w:rPr>
-              <w:t>Tổng khấu trừ (BHXH, đi muộn...)</w:t>
-            </w:r>
-          </w:p>
-        </w:tc>
-        <w:tc>
-          <w:tcPr>
-            <w:tcW w:type="dxa" w:w="3024"/>
-            <w:shd w:val="clear" w:color="auto" w:fill="EBF4FB"/>
-          </w:tcPr>
-          <w:p>
-            <w:r>
-              <w:rPr>
-                <w:sz w:val="22"/>
-              </w:rPr>
-              <w:t>Theo chính sách + pháp luật</w:t>
-            </w:r>
-          </w:p>
-        </w:tc>
-      </w:tr>
-    </w:tbl>
-    <w:p/>
-    <w:p/>
-    <w:p>
-      <w:pPr>
-        <w:spacing w:after="80"/>
-      </w:pPr>
-      <w:r>
-        <w:rPr>
-          <w:b/>
-        </w:rPr>
-        <w:t>Kiến trúc tách biệt hệ số khỏi mã nguồn:</w:t>
-      </w:r>
-    </w:p>
-    <w:p/>
-    <w:p>
-      <w:pPr>
-        <w:ind w:left="567"/>
-      </w:pPr>
-      <w:r>
-        <w:rPr>
-          <w:i/>
-          <w:color w:val="555555"/>
-        </w:rPr>
-        <w:t>Mọi hệ số $M_j$ và $N_k$ được lưu trong **Bảng ma trận cấu hình (Compliance Matrix)** riêng biệt trong CSDL, không hardcode vào logic code. Khi Chính phủ ban hành quy định mới, Nhân sự chỉ cần cập nhật bảng cấu hình mà **không cần phát hành phiên bản phần mềm mới**.</w:t>
-      </w:r>
-    </w:p>
-    <w:p/>
-    <w:tbl>
-      <w:tblPr>
-        <w:tblStyle w:val="TableGrid"/>
-        <w:tblW w:type="auto" w:w="0"/>
-        <w:tblLook w:firstColumn="1" w:firstRow="1" w:lastColumn="0" w:lastRow="0" w:noHBand="0" w:noVBand="1" w:val="04A0"/>
-      </w:tblPr>
-      <w:tblGrid>
-        <w:gridCol w:w="4535"/>
-        <w:gridCol w:w="4535"/>
-      </w:tblGrid>
-      <w:tr>
-        <w:tc>
-          <w:tcPr>
-            <w:tcW w:type="dxa" w:w="4535"/>
-            <w:shd w:val="clear" w:color="auto" w:fill="1F619E"/>
-          </w:tcPr>
-          <w:p>
-            <w:r>
-              <w:rPr>
-                <w:b/>
-                <w:color w:val="FFFFFF"/>
-                <w:sz w:val="22"/>
-              </w:rPr>
-              <w:t>Bảng</w:t>
-            </w:r>
-          </w:p>
-        </w:tc>
-        <w:tc>
-          <w:tcPr>
-            <w:tcW w:type="dxa" w:w="4535"/>
-            <w:shd w:val="clear" w:color="auto" w:fill="1F619E"/>
-          </w:tcPr>
-          <w:p>
-            <w:r>
-              <w:rPr>
-                <w:b/>
-                <w:color w:val="FFFFFF"/>
-                <w:sz w:val="22"/>
-              </w:rPr>
-              <w:t>compliance_matrix</w:t>
-            </w:r>
-          </w:p>
-        </w:tc>
-      </w:tr>
-      <w:tr>
-        <w:tc>
-          <w:tcPr>
-            <w:tcW w:type="dxa" w:w="4535"/>
-          </w:tcPr>
-          <w:p>
-            <w:r>
-              <w:rPr>
-                <w:sz w:val="22"/>
-              </w:rPr>
-              <w:t>loai_ca</w:t>
-            </w:r>
-          </w:p>
-        </w:tc>
-        <w:tc>
-          <w:tcPr>
-            <w:tcW w:type="dxa" w:w="4535"/>
-          </w:tcPr>
-          <w:p>
-            <w:r>
-              <w:rPr>
-                <w:sz w:val="22"/>
-              </w:rPr>
-              <w:t>ENUM: 'ngay_thuong', 'ngay_nghi', 'le_tet', 'ca_dem'</w:t>
-            </w:r>
-          </w:p>
-        </w:tc>
-      </w:tr>
-      <w:tr>
-        <w:tc>
-          <w:tcPr>
-            <w:tcW w:type="dxa" w:w="4535"/>
-            <w:shd w:val="clear" w:color="auto" w:fill="EBF4FB"/>
-          </w:tcPr>
-          <w:p>
-            <w:r>
-              <w:rPr>
-                <w:sz w:val="22"/>
-              </w:rPr>
-              <w:t>he_so</w:t>
-            </w:r>
-          </w:p>
-        </w:tc>
-        <w:tc>
-          <w:tcPr>
-            <w:tcW w:type="dxa" w:w="4535"/>
-            <w:shd w:val="clear" w:color="auto" w:fill="EBF4FB"/>
-          </w:tcPr>
-          <w:p>
-            <w:r>
-              <w:rPr>
-                <w:sz w:val="22"/>
-              </w:rPr>
-              <w:t>DECIMAL(4,2) — hệ số áp dụng</w:t>
-            </w:r>
-          </w:p>
-        </w:tc>
-      </w:tr>
-      <w:tr>
-        <w:tc>
-          <w:tcPr>
-            <w:tcW w:type="dxa" w:w="4535"/>
-          </w:tcPr>
-          <w:p>
-            <w:r>
-              <w:rPr>
-                <w:sz w:val="22"/>
-              </w:rPr>
-              <w:t>hieu_luc_tu</w:t>
-            </w:r>
-          </w:p>
-        </w:tc>
-        <w:tc>
-          <w:tcPr>
-            <w:tcW w:type="dxa" w:w="4535"/>
-          </w:tcPr>
-          <w:p>
-            <w:r>
-              <w:rPr>
-                <w:sz w:val="22"/>
-              </w:rPr>
-              <w:t>DATE — ngày bắt đầu hiệu lực</w:t>
-            </w:r>
-          </w:p>
-        </w:tc>
-      </w:tr>
-      <w:tr>
-        <w:tc>
-          <w:tcPr>
-            <w:tcW w:type="dxa" w:w="4535"/>
-            <w:shd w:val="clear" w:color="auto" w:fill="EBF4FB"/>
-          </w:tcPr>
-          <w:p>
-            <w:r>
-              <w:rPr>
-                <w:sz w:val="22"/>
-              </w:rPr>
-              <w:t>van_ban_phap_ly</w:t>
-            </w:r>
-          </w:p>
-        </w:tc>
-        <w:tc>
-          <w:tcPr>
-            <w:tcW w:type="dxa" w:w="4535"/>
-            <w:shd w:val="clear" w:color="auto" w:fill="EBF4FB"/>
-          </w:tcPr>
-          <w:p>
-            <w:r>
-              <w:rPr>
-                <w:sz w:val="22"/>
-              </w:rPr>
-              <w:t>VARCHAR — số nghị định tham chiếu</w:t>
-            </w:r>
-          </w:p>
-        </w:tc>
-      </w:tr>
-    </w:tbl>
-    <w:p/>
+        <w:t>mô hình tính lương tối giản</w:t>
+      </w:r>
+      <w:r>
+        <w:t xml:space="preserve"> với 2 loại ca cố định: sáng và tối.</w:t>
+      </w:r>
+    </w:p>
     <w:p/>
     <w:p>
       <w:pPr>
@@ -20456,28 +19429,10 @@
           <w:color w:val="2E86AB"/>
           <w:sz w:val="26"/>
         </w:rPr>
-        <w:t>3.6. Payroll Engine Đa biến — Tuân thủ NĐ 38/2022/NĐ-CP</w:t>
-      </w:r>
-    </w:p>
-    <w:p/>
-    <w:p/>
-    <w:p>
-      <w:pPr>
-        <w:spacing w:after="80"/>
-      </w:pPr>
-      <w:r>
-        <w:t xml:space="preserve">Hệ thống loại bỏ công thức tính lương đơn giản và triển khai </w:t>
-      </w:r>
-      <w:r>
-        <w:rPr>
-          <w:b/>
-        </w:rPr>
-        <w:t>động cơ tính lương đa biến</w:t>
-      </w:r>
-      <w:r>
-        <w:t xml:space="preserve"> tuân thủ đầy đủ pháp luật lao động Việt Nam:</w:t>
-      </w:r>
-    </w:p>
+        <w:t>3.6. Tính lương theo 2 ca cố định</w:t>
+      </w:r>
+    </w:p>
+    <w:p/>
     <w:p/>
     <w:p>
       <w:pPr>
@@ -20488,613 +19443,9 @@
           <w:rFonts w:ascii="Cambria Math" w:hAnsi="Cambria Math"/>
           <w:sz w:val="24"/>
         </w:rPr>
-        <w:t>$$S_{total} = \sum_{i=1}^{n} \left( H_{basic,i} \times R \right) + \sum_{j=1}^{m} \left( H_{OT,j} \times R \times M_j \right) + \sum_{k=1}^{p} \left( H_{night,k} \times R \times N_k \right) + A_{total} - D_{total}$$</w:t>
-      </w:r>
-    </w:p>
-    <w:p/>
-    <w:p>
-      <w:pPr>
-        <w:spacing w:after="80"/>
-      </w:pPr>
-      <w:r>
-        <w:rPr>
-          <w:b/>
-        </w:rPr>
-        <w:t>Giải thích các biến số:</w:t>
-      </w:r>
-    </w:p>
-    <w:p/>
-    <w:tbl>
-      <w:tblPr>
-        <w:tblStyle w:val="TableGrid"/>
-        <w:tblW w:type="auto" w:w="0"/>
-        <w:tblLook w:firstColumn="1" w:firstRow="1" w:lastColumn="0" w:lastRow="0" w:noHBand="0" w:noVBand="1" w:val="04A0"/>
-      </w:tblPr>
-      <w:tblGrid>
-        <w:gridCol w:w="3024"/>
-        <w:gridCol w:w="3024"/>
-        <w:gridCol w:w="3024"/>
-      </w:tblGrid>
-      <w:tr>
-        <w:tc>
-          <w:tcPr>
-            <w:tcW w:type="dxa" w:w="3024"/>
-            <w:shd w:val="clear" w:color="auto" w:fill="1F619E"/>
-          </w:tcPr>
-          <w:p>
-            <w:r>
-              <w:rPr>
-                <w:b/>
-                <w:color w:val="FFFFFF"/>
-                <w:sz w:val="22"/>
-              </w:rPr>
-              <w:t>Biến</w:t>
-            </w:r>
-          </w:p>
-        </w:tc>
-        <w:tc>
-          <w:tcPr>
-            <w:tcW w:type="dxa" w:w="3024"/>
-            <w:shd w:val="clear" w:color="auto" w:fill="1F619E"/>
-          </w:tcPr>
-          <w:p>
-            <w:r>
-              <w:rPr>
-                <w:b/>
-                <w:color w:val="FFFFFF"/>
-                <w:sz w:val="22"/>
-              </w:rPr>
-              <w:t>Ý nghĩa</w:t>
-            </w:r>
-          </w:p>
-        </w:tc>
-        <w:tc>
-          <w:tcPr>
-            <w:tcW w:type="dxa" w:w="3024"/>
-            <w:shd w:val="clear" w:color="auto" w:fill="1F619E"/>
-          </w:tcPr>
-          <w:p>
-            <w:r>
-              <w:rPr>
-                <w:b/>
-                <w:color w:val="FFFFFF"/>
-                <w:sz w:val="22"/>
-              </w:rPr>
-              <w:t>Giá trị theo luật</w:t>
-            </w:r>
-          </w:p>
-        </w:tc>
-      </w:tr>
-      <w:tr>
-        <w:tc>
-          <w:tcPr>
-            <w:tcW w:type="dxa" w:w="3024"/>
-          </w:tcPr>
-          <w:p>
-            <w:r>
-              <w:rPr>
-                <w:sz w:val="22"/>
-              </w:rPr>
-              <w:t>$H_{basic,i}$</w:t>
-            </w:r>
-          </w:p>
-        </w:tc>
-        <w:tc>
-          <w:tcPr>
-            <w:tcW w:type="dxa" w:w="3024"/>
-          </w:tcPr>
-          <w:p>
-            <w:r>
-              <w:rPr>
-                <w:sz w:val="22"/>
-              </w:rPr>
-              <w:t>Giờ hành chính tiêu chuẩn</w:t>
-            </w:r>
-          </w:p>
-        </w:tc>
-        <w:tc>
-          <w:tcPr>
-            <w:tcW w:type="dxa" w:w="3024"/>
-          </w:tcPr>
-          <w:p>
-            <w:r>
-              <w:rPr>
-                <w:sz w:val="22"/>
-              </w:rPr>
-              <w:t>≤ 8h/ngày, ≤ 48h/tuần</w:t>
-            </w:r>
-          </w:p>
-        </w:tc>
-      </w:tr>
-      <w:tr>
-        <w:tc>
-          <w:tcPr>
-            <w:tcW w:type="dxa" w:w="3024"/>
-            <w:shd w:val="clear" w:color="auto" w:fill="EBF4FB"/>
-          </w:tcPr>
-          <w:p>
-            <w:r>
-              <w:rPr>
-                <w:sz w:val="22"/>
-              </w:rPr>
-              <w:t>$R$</w:t>
-            </w:r>
-          </w:p>
-        </w:tc>
-        <w:tc>
-          <w:tcPr>
-            <w:tcW w:type="dxa" w:w="3024"/>
-            <w:shd w:val="clear" w:color="auto" w:fill="EBF4FB"/>
-          </w:tcPr>
-          <w:p>
-            <w:r>
-              <w:rPr>
-                <w:sz w:val="22"/>
-              </w:rPr>
-              <w:t>Lương cơ bản theo giờ</w:t>
-            </w:r>
-          </w:p>
-        </w:tc>
-        <w:tc>
-          <w:tcPr>
-            <w:tcW w:type="dxa" w:w="3024"/>
-            <w:shd w:val="clear" w:color="auto" w:fill="EBF4FB"/>
-          </w:tcPr>
-          <w:p>
-            <w:r>
-              <w:rPr>
-                <w:sz w:val="22"/>
-              </w:rPr>
-              <w:t>≥ 22.500 đ/giờ (Vùng I, 2024)</w:t>
-            </w:r>
-          </w:p>
-        </w:tc>
-      </w:tr>
-      <w:tr>
-        <w:tc>
-          <w:tcPr>
-            <w:tcW w:type="dxa" w:w="3024"/>
-          </w:tcPr>
-          <w:p>
-            <w:r>
-              <w:rPr>
-                <w:sz w:val="22"/>
-              </w:rPr>
-              <w:t>$H_{OT,j}$</w:t>
-            </w:r>
-          </w:p>
-        </w:tc>
-        <w:tc>
-          <w:tcPr>
-            <w:tcW w:type="dxa" w:w="3024"/>
-          </w:tcPr>
-          <w:p>
-            <w:r>
-              <w:rPr>
-                <w:sz w:val="22"/>
-              </w:rPr>
-              <w:t>Giờ làm thêm (tăng ca)</w:t>
-            </w:r>
-          </w:p>
-        </w:tc>
-        <w:tc>
-          <w:tcPr>
-            <w:tcW w:type="dxa" w:w="3024"/>
-          </w:tcPr>
-          <w:p>
-            <w:r>
-              <w:rPr>
-                <w:sz w:val="22"/>
-              </w:rPr>
-              <w:t>≤ 40h/tháng, ≤ 200h/năm</w:t>
-            </w:r>
-          </w:p>
-        </w:tc>
-      </w:tr>
-      <w:tr>
-        <w:tc>
-          <w:tcPr>
-            <w:tcW w:type="dxa" w:w="3024"/>
-            <w:shd w:val="clear" w:color="auto" w:fill="EBF4FB"/>
-          </w:tcPr>
-          <w:p>
-            <w:r>
-              <w:rPr>
-                <w:sz w:val="22"/>
-              </w:rPr>
-              <w:t>$M_j$</w:t>
-            </w:r>
-          </w:p>
-        </w:tc>
-        <w:tc>
-          <w:tcPr>
-            <w:tcW w:type="dxa" w:w="3024"/>
-            <w:shd w:val="clear" w:color="auto" w:fill="EBF4FB"/>
-          </w:tcPr>
-          <w:p>
-            <w:r>
-              <w:rPr>
-                <w:sz w:val="22"/>
-              </w:rPr>
-              <w:t>Hệ số tăng ca</w:t>
-            </w:r>
-          </w:p>
-        </w:tc>
-        <w:tc>
-          <w:tcPr>
-            <w:tcW w:type="dxa" w:w="3024"/>
-            <w:shd w:val="clear" w:color="auto" w:fill="EBF4FB"/>
-          </w:tcPr>
-          <w:p>
-            <w:r>
-              <w:rPr>
-                <w:sz w:val="22"/>
-              </w:rPr>
-              <w:t>1.5 (ngày thường) / 2.0 (ngày nghỉ) / 3.0 (Lễ, Tết)</w:t>
-            </w:r>
-          </w:p>
-        </w:tc>
-      </w:tr>
-      <w:tr>
-        <w:tc>
-          <w:tcPr>
-            <w:tcW w:type="dxa" w:w="3024"/>
-          </w:tcPr>
-          <w:p>
-            <w:r>
-              <w:rPr>
-                <w:sz w:val="22"/>
-              </w:rPr>
-              <w:t>$H_{night,k}$</w:t>
-            </w:r>
-          </w:p>
-        </w:tc>
-        <w:tc>
-          <w:tcPr>
-            <w:tcW w:type="dxa" w:w="3024"/>
-          </w:tcPr>
-          <w:p>
-            <w:r>
-              <w:rPr>
-                <w:sz w:val="22"/>
-              </w:rPr>
-              <w:t>Giờ làm ca đêm (22:00–06:00)</w:t>
-            </w:r>
-          </w:p>
-        </w:tc>
-        <w:tc>
-          <w:tcPr>
-            <w:tcW w:type="dxa" w:w="3024"/>
-          </w:tcPr>
-          <w:p>
-            <w:r>
-              <w:rPr>
-                <w:sz w:val="22"/>
-              </w:rPr>
-              <w:t>Theo lịch thực tế</w:t>
-            </w:r>
-          </w:p>
-        </w:tc>
-      </w:tr>
-      <w:tr>
-        <w:tc>
-          <w:tcPr>
-            <w:tcW w:type="dxa" w:w="3024"/>
-            <w:shd w:val="clear" w:color="auto" w:fill="EBF4FB"/>
-          </w:tcPr>
-          <w:p>
-            <w:r>
-              <w:rPr>
-                <w:sz w:val="22"/>
-              </w:rPr>
-              <w:t>$N_k$</w:t>
-            </w:r>
-          </w:p>
-        </w:tc>
-        <w:tc>
-          <w:tcPr>
-            <w:tcW w:type="dxa" w:w="3024"/>
-            <w:shd w:val="clear" w:color="auto" w:fill="EBF4FB"/>
-          </w:tcPr>
-          <w:p>
-            <w:r>
-              <w:rPr>
-                <w:sz w:val="22"/>
-              </w:rPr>
-              <w:t>Hệ số phụ cấp đêm</w:t>
-            </w:r>
-          </w:p>
-        </w:tc>
-        <w:tc>
-          <w:tcPr>
-            <w:tcW w:type="dxa" w:w="3024"/>
-            <w:shd w:val="clear" w:color="auto" w:fill="EBF4FB"/>
-          </w:tcPr>
-          <w:p>
-            <w:r>
-              <w:rPr>
-                <w:sz w:val="22"/>
-              </w:rPr>
-              <w:t>+30% (≥ 1.3); nếu vừa tăng ca vừa đêm → cộng thêm +20%</w:t>
-            </w:r>
-          </w:p>
-        </w:tc>
-      </w:tr>
-      <w:tr>
-        <w:tc>
-          <w:tcPr>
-            <w:tcW w:type="dxa" w:w="3024"/>
-          </w:tcPr>
-          <w:p>
-            <w:r>
-              <w:rPr>
-                <w:sz w:val="22"/>
-              </w:rPr>
-              <w:t>$A_{total}$</w:t>
-            </w:r>
-          </w:p>
-        </w:tc>
-        <w:tc>
-          <w:tcPr>
-            <w:tcW w:type="dxa" w:w="3024"/>
-          </w:tcPr>
-          <w:p>
-            <w:r>
-              <w:rPr>
-                <w:sz w:val="22"/>
-              </w:rPr>
-              <w:t>Tổng phụ cấp (ăn ca, xăng xe...)</w:t>
-            </w:r>
-          </w:p>
-        </w:tc>
-        <w:tc>
-          <w:tcPr>
-            <w:tcW w:type="dxa" w:w="3024"/>
-          </w:tcPr>
-          <w:p>
-            <w:r>
-              <w:rPr>
-                <w:sz w:val="22"/>
-              </w:rPr>
-              <w:t>Theo chính sách quán</w:t>
-            </w:r>
-          </w:p>
-        </w:tc>
-      </w:tr>
-      <w:tr>
-        <w:tc>
-          <w:tcPr>
-            <w:tcW w:type="dxa" w:w="3024"/>
-            <w:shd w:val="clear" w:color="auto" w:fill="EBF4FB"/>
-          </w:tcPr>
-          <w:p>
-            <w:r>
-              <w:rPr>
-                <w:sz w:val="22"/>
-              </w:rPr>
-              <w:t>$D_{total}$</w:t>
-            </w:r>
-          </w:p>
-        </w:tc>
-        <w:tc>
-          <w:tcPr>
-            <w:tcW w:type="dxa" w:w="3024"/>
-            <w:shd w:val="clear" w:color="auto" w:fill="EBF4FB"/>
-          </w:tcPr>
-          <w:p>
-            <w:r>
-              <w:rPr>
-                <w:sz w:val="22"/>
-              </w:rPr>
-              <w:t>Tổng khấu trừ (BHXH, đi muộn...)</w:t>
-            </w:r>
-          </w:p>
-        </w:tc>
-        <w:tc>
-          <w:tcPr>
-            <w:tcW w:type="dxa" w:w="3024"/>
-            <w:shd w:val="clear" w:color="auto" w:fill="EBF4FB"/>
-          </w:tcPr>
-          <w:p>
-            <w:r>
-              <w:rPr>
-                <w:sz w:val="22"/>
-              </w:rPr>
-              <w:t>Theo chính sách + pháp luật</w:t>
-            </w:r>
-          </w:p>
-        </w:tc>
-      </w:tr>
-    </w:tbl>
-    <w:p/>
-    <w:p/>
-    <w:p>
-      <w:pPr>
-        <w:spacing w:after="80"/>
-      </w:pPr>
-      <w:r>
-        <w:rPr>
-          <w:b/>
-        </w:rPr>
-        <w:t>Kiến trúc tách biệt hệ số khỏi mã nguồn:</w:t>
-      </w:r>
-    </w:p>
-    <w:p/>
-    <w:p>
-      <w:pPr>
-        <w:ind w:left="567"/>
-      </w:pPr>
-      <w:r>
-        <w:rPr>
-          <w:i/>
-          <w:color w:val="555555"/>
-        </w:rPr>
-        <w:t>Mọi hệ số $M_j$ và $N_k$ được lưu trong **Bảng ma trận cấu hình (Compliance Matrix)** riêng biệt trong CSDL, không hardcode vào logic code. Khi Chính phủ ban hành quy định mới, Nhân sự chỉ cần cập nhật bảng cấu hình mà **không cần phát hành phiên bản phần mềm mới**.</w:t>
-      </w:r>
-    </w:p>
-    <w:p/>
-    <w:tbl>
-      <w:tblPr>
-        <w:tblStyle w:val="TableGrid"/>
-        <w:tblW w:type="auto" w:w="0"/>
-        <w:tblLook w:firstColumn="1" w:firstRow="1" w:lastColumn="0" w:lastRow="0" w:noHBand="0" w:noVBand="1" w:val="04A0"/>
-      </w:tblPr>
-      <w:tblGrid>
-        <w:gridCol w:w="4535"/>
-        <w:gridCol w:w="4535"/>
-      </w:tblGrid>
-      <w:tr>
-        <w:tc>
-          <w:tcPr>
-            <w:tcW w:type="dxa" w:w="4535"/>
-            <w:shd w:val="clear" w:color="auto" w:fill="1F619E"/>
-          </w:tcPr>
-          <w:p>
-            <w:r>
-              <w:rPr>
-                <w:b/>
-                <w:color w:val="FFFFFF"/>
-                <w:sz w:val="22"/>
-              </w:rPr>
-              <w:t>Bảng</w:t>
-            </w:r>
-          </w:p>
-        </w:tc>
-        <w:tc>
-          <w:tcPr>
-            <w:tcW w:type="dxa" w:w="4535"/>
-            <w:shd w:val="clear" w:color="auto" w:fill="1F619E"/>
-          </w:tcPr>
-          <w:p>
-            <w:r>
-              <w:rPr>
-                <w:b/>
-                <w:color w:val="FFFFFF"/>
-                <w:sz w:val="22"/>
-              </w:rPr>
-              <w:t>compliance_matrix</w:t>
-            </w:r>
-          </w:p>
-        </w:tc>
-      </w:tr>
-      <w:tr>
-        <w:tc>
-          <w:tcPr>
-            <w:tcW w:type="dxa" w:w="4535"/>
-          </w:tcPr>
-          <w:p>
-            <w:r>
-              <w:rPr>
-                <w:sz w:val="22"/>
-              </w:rPr>
-              <w:t>loai_ca</w:t>
-            </w:r>
-          </w:p>
-        </w:tc>
-        <w:tc>
-          <w:tcPr>
-            <w:tcW w:type="dxa" w:w="4535"/>
-          </w:tcPr>
-          <w:p>
-            <w:r>
-              <w:rPr>
-                <w:sz w:val="22"/>
-              </w:rPr>
-              <w:t>ENUM: 'ngay_thuong', 'ngay_nghi', 'le_tet', 'ca_dem'</w:t>
-            </w:r>
-          </w:p>
-        </w:tc>
-      </w:tr>
-      <w:tr>
-        <w:tc>
-          <w:tcPr>
-            <w:tcW w:type="dxa" w:w="4535"/>
-            <w:shd w:val="clear" w:color="auto" w:fill="EBF4FB"/>
-          </w:tcPr>
-          <w:p>
-            <w:r>
-              <w:rPr>
-                <w:sz w:val="22"/>
-              </w:rPr>
-              <w:t>he_so</w:t>
-            </w:r>
-          </w:p>
-        </w:tc>
-        <w:tc>
-          <w:tcPr>
-            <w:tcW w:type="dxa" w:w="4535"/>
-            <w:shd w:val="clear" w:color="auto" w:fill="EBF4FB"/>
-          </w:tcPr>
-          <w:p>
-            <w:r>
-              <w:rPr>
-                <w:sz w:val="22"/>
-              </w:rPr>
-              <w:t>DECIMAL(4,2) — hệ số áp dụng</w:t>
-            </w:r>
-          </w:p>
-        </w:tc>
-      </w:tr>
-      <w:tr>
-        <w:tc>
-          <w:tcPr>
-            <w:tcW w:type="dxa" w:w="4535"/>
-          </w:tcPr>
-          <w:p>
-            <w:r>
-              <w:rPr>
-                <w:sz w:val="22"/>
-              </w:rPr>
-              <w:t>hieu_luc_tu</w:t>
-            </w:r>
-          </w:p>
-        </w:tc>
-        <w:tc>
-          <w:tcPr>
-            <w:tcW w:type="dxa" w:w="4535"/>
-          </w:tcPr>
-          <w:p>
-            <w:r>
-              <w:rPr>
-                <w:sz w:val="22"/>
-              </w:rPr>
-              <w:t>DATE — ngày bắt đầu hiệu lực</w:t>
-            </w:r>
-          </w:p>
-        </w:tc>
-      </w:tr>
-      <w:tr>
-        <w:tc>
-          <w:tcPr>
-            <w:tcW w:type="dxa" w:w="4535"/>
-            <w:shd w:val="clear" w:color="auto" w:fill="EBF4FB"/>
-          </w:tcPr>
-          <w:p>
-            <w:r>
-              <w:rPr>
-                <w:sz w:val="22"/>
-              </w:rPr>
-              <w:t>van_ban_phap_ly</w:t>
-            </w:r>
-          </w:p>
-        </w:tc>
-        <w:tc>
-          <w:tcPr>
-            <w:tcW w:type="dxa" w:w="4535"/>
-            <w:shd w:val="clear" w:color="auto" w:fill="EBF4FB"/>
-          </w:tcPr>
-          <w:p>
-            <w:r>
-              <w:rPr>
-                <w:sz w:val="22"/>
-              </w:rPr>
-              <w:t>VARCHAR — số nghị định tham chiếu</w:t>
-            </w:r>
-          </w:p>
-        </w:tc>
-      </w:tr>
-    </w:tbl>
-    <w:p/>
+        <w:t>$$S_{total} = (N_{sang} \times R_{sang}) + (N_{toi} \times R_{toi})$$</w:t>
+      </w:r>
+    </w:p>
     <w:p/>
     <w:p>
       <w:pPr>
@@ -21357,20 +19708,20 @@
               <w:rPr>
                 <w:sz w:val="22"/>
               </w:rPr>
-              <w:t>so_gio_lam không được tính nếu check_out_time IS NULL</w:t>
-            </w:r>
-          </w:p>
-        </w:tc>
-        <w:tc>
-          <w:tcPr>
-            <w:tcW w:type="dxa" w:w="3024"/>
-          </w:tcPr>
-          <w:p>
-            <w:r>
-              <w:rPr>
-                <w:sz w:val="22"/>
-              </w:rPr>
-              <w:t>Dùng CASE WHEN trong câu truy vấn tính lương</w:t>
+              <w:t>Chỉ ca có đủ check_in_time và check_out_time mới được đưa vào bảng lương</w:t>
+            </w:r>
+          </w:p>
+        </w:tc>
+        <w:tc>
+          <w:tcPr>
+            <w:tcW w:type="dxa" w:w="3024"/>
+          </w:tcPr>
+          <w:p>
+            <w:r>
+              <w:rPr>
+                <w:sz w:val="22"/>
+              </w:rPr>
+              <w:t>Dùng CASE WHEN hoặc cờ trạng thái hợp lệ khi tổng hợp lương</w:t>
             </w:r>
           </w:p>
         </w:tc>
@@ -21442,20 +19793,20 @@
               <w:rPr>
                 <w:sz w:val="22"/>
               </w:rPr>
-              <w:t>Ca cuối tuần (Thứ 7, Chủ nhật) được nhân hệ số 1.5</w:t>
-            </w:r>
-          </w:p>
-        </w:tc>
-        <w:tc>
-          <w:tcPr>
-            <w:tcW w:type="dxa" w:w="3024"/>
-          </w:tcPr>
-          <w:p>
-            <w:r>
-              <w:rPr>
-                <w:sz w:val="22"/>
-              </w:rPr>
-              <w:t>Hàm tính lương kiểm tra DAYOFWEEK(ngay_lam_viec) trước khi áp đơn giá</w:t>
+              <w:t>Mỗi ca phải thuộc đúng 1 trong 2 loại: sang hoặc toi</w:t>
+            </w:r>
+          </w:p>
+        </w:tc>
+        <w:tc>
+          <w:tcPr>
+            <w:tcW w:type="dxa" w:w="3024"/>
+          </w:tcPr>
+          <w:p>
+            <w:r>
+              <w:rPr>
+                <w:sz w:val="22"/>
+              </w:rPr>
+              <w:t>Ràng buộc ENUM / validation tại bảng shift_template và shift</w:t>
             </w:r>
           </w:p>
         </w:tc>
@@ -21650,20 +20001,20 @@
               <w:rPr>
                 <w:sz w:val="22"/>
               </w:rPr>
-              <w:t>so_gio_lam không được tính nếu check_out_time IS NULL</w:t>
-            </w:r>
-          </w:p>
-        </w:tc>
-        <w:tc>
-          <w:tcPr>
-            <w:tcW w:type="dxa" w:w="3024"/>
-          </w:tcPr>
-          <w:p>
-            <w:r>
-              <w:rPr>
-                <w:sz w:val="22"/>
-              </w:rPr>
-              <w:t>Dùng CASE WHEN trong câu truy vấn tính lương</w:t>
+              <w:t>Chỉ ca có đủ check_in_time và check_out_time mới được đưa vào bảng lương</w:t>
+            </w:r>
+          </w:p>
+        </w:tc>
+        <w:tc>
+          <w:tcPr>
+            <w:tcW w:type="dxa" w:w="3024"/>
+          </w:tcPr>
+          <w:p>
+            <w:r>
+              <w:rPr>
+                <w:sz w:val="22"/>
+              </w:rPr>
+              <w:t>Dùng CASE WHEN hoặc cờ trạng thái hợp lệ khi tổng hợp lương</w:t>
             </w:r>
           </w:p>
         </w:tc>
@@ -21735,20 +20086,20 @@
               <w:rPr>
                 <w:sz w:val="22"/>
               </w:rPr>
-              <w:t>Ca cuối tuần (Thứ 7, Chủ nhật) được nhân hệ số 1.5</w:t>
-            </w:r>
-          </w:p>
-        </w:tc>
-        <w:tc>
-          <w:tcPr>
-            <w:tcW w:type="dxa" w:w="3024"/>
-          </w:tcPr>
-          <w:p>
-            <w:r>
-              <w:rPr>
-                <w:sz w:val="22"/>
-              </w:rPr>
-              <w:t>Hàm tính lương kiểm tra DAYOFWEEK(ngay_lam_viec) trước khi áp đơn giá</w:t>
+              <w:t>Mỗi ca phải thuộc đúng 1 trong 2 loại: sang hoặc toi</w:t>
+            </w:r>
+          </w:p>
+        </w:tc>
+        <w:tc>
+          <w:tcPr>
+            <w:tcW w:type="dxa" w:w="3024"/>
+          </w:tcPr>
+          <w:p>
+            <w:r>
+              <w:rPr>
+                <w:sz w:val="22"/>
+              </w:rPr>
+              <w:t>Ràng buộc ENUM / validation tại bảng shift_template và shift</w:t>
             </w:r>
           </w:p>
         </w:tc>
@@ -24604,7 +22955,7 @@
               <w:rPr>
                 <w:sz w:val="22"/>
               </w:rPr>
-              <w:t>Tính lương ca thường</w:t>
+              <w:t>Tính lương 1 ca sáng ngày thường</w:t>
             </w:r>
           </w:p>
         </w:tc>
@@ -24617,7 +22968,7 @@
               <w:rPr>
                 <w:sz w:val="22"/>
               </w:rPr>
-              <w:t>8 giờ làm, đơn giá 25.000đ/giờ</w:t>
+              <w:t>Hoàn thành 1 ca sáng, R_sang = 120.000đ</w:t>
             </w:r>
           </w:p>
         </w:tc>
@@ -24630,7 +22981,7 @@
               <w:rPr>
                 <w:sz w:val="22"/>
               </w:rPr>
-              <w:t>Lương = 8 × 25.000 = 200.000đ</w:t>
+              <w:t>Lương = 120.000đ</w:t>
             </w:r>
           </w:p>
         </w:tc>
@@ -24660,7 +23011,7 @@
               <w:rPr>
                 <w:sz w:val="22"/>
               </w:rPr>
-              <w:t>Tính lương ca cuối tuần</w:t>
+              <w:t>Tính lương 1 ca tối cuối tuần</w:t>
             </w:r>
           </w:p>
         </w:tc>
@@ -24674,7 +23025,7 @@
               <w:rPr>
                 <w:sz w:val="22"/>
               </w:rPr>
-              <w:t>8 giờ làm, đơn giá 25.000đ/giờ, hệ số 1.5</w:t>
+              <w:t>Hoàn thành 1 ca tối cuối tuần, R_toi = 140.000đ</w:t>
             </w:r>
           </w:p>
         </w:tc>
@@ -24688,7 +23039,7 @@
               <w:rPr>
                 <w:sz w:val="22"/>
               </w:rPr>
-              <w:t>Lương = 8 × 25.000 × 1.5 = 300.000đ</w:t>
+              <w:t>Lương = 140.000 × 1.5 = 210.000đ</w:t>
             </w:r>
           </w:p>
         </w:tc>
@@ -24742,7 +23093,7 @@
               <w:rPr>
                 <w:sz w:val="22"/>
               </w:rPr>
-              <w:t>so_gio_lam = 0; không tính vào lương</w:t>
+              <w:t>Chưa đưa vào bảng lương, chờ quản lý xác nhận</w:t>
             </w:r>
           </w:p>
         </w:tc>
@@ -24786,7 +23137,7 @@
               <w:rPr>
                 <w:sz w:val="22"/>
               </w:rPr>
-              <w:t>22 ca thường (8h) + 4 ca cuối tuần (8h)</w:t>
+              <w:t>18 ca sáng ngày thường + 8 ca tối ngày thường + 2 ca tối cuối tuần + 1 ca sáng ngày lễ</w:t>
             </w:r>
           </w:p>
         </w:tc>
@@ -24800,7 +23151,7 @@
               <w:rPr>
                 <w:sz w:val="22"/>
               </w:rPr>
-              <w:t>L = 22×8×25k + 4×8×25k×1.5 = 4.400.000 + 1.200.000 = 5.600.000đ</w:t>
+              <w:t>L = 18×120.000 + 8×140.000 + 2×140.000×1.5 + 1×120.000×2.0 = 3.940.000đ</w:t>
             </w:r>
           </w:p>
         </w:tc>
@@ -25011,7 +23362,7 @@
               <w:rPr>
                 <w:sz w:val="22"/>
               </w:rPr>
-              <w:t>Lương thấp hơn tối thiểu vùng</w:t>
+              <w:t>Mức lương ca nhập không hợp lệ</w:t>
             </w:r>
           </w:p>
         </w:tc>
@@ -25025,7 +23376,7 @@
               <w:rPr>
                 <w:sz w:val="22"/>
               </w:rPr>
-              <w:t>luong_gio = 15000 (&lt; 22.500đ)</w:t>
+              <w:t>Mức lương ca sáng hoặc ca tối nhỏ hơn cấu hình tối thiểu của quán</w:t>
             </w:r>
           </w:p>
         </w:tc>
@@ -28409,7 +26760,7 @@
           <w:rFonts w:ascii="Cambria Math" w:hAnsi="Cambria Math"/>
           <w:sz w:val="24"/>
         </w:rPr>
-        <w:t>$$L_{nv} = \sum_{i=1}^{n} \left[ (t_{checkout_i} - t_{checkin_i}) \times r_{ca_i} \right] - P_{tre} + B_{bonus}$$</w:t>
+        <w:t>$$L_{nv} = \sum (N_{sang,thuong} \times R_{sang}) + \sum (N_{toi,thuong} \times R_{toi}) + \sum (N_{cuoi_tuan} \times R_{ca} \times 1.5) + \sum (N_{ngay_le} \times R_{ca} \times 2.0)$$</w:t>
       </w:r>
     </w:p>
     <w:p/>
@@ -28436,7 +26787,7 @@
         <w:spacing w:after="80"/>
       </w:pPr>
       <w:r>
-        <w:t>$t_{checkout_i} - t_{checkin_i}$: Số giờ làm thực tế của ca $i$ (tính bằng giờ, làm tròn 2 chữ số thập phân)</w:t>
+        <w:t>$N_{sang,thuong}$: Số ca sáng ngày thường đã hoàn thành trong kỳ</w:t>
       </w:r>
     </w:p>
     <w:p/>
@@ -28445,7 +26796,7 @@
         <w:spacing w:after="80"/>
       </w:pPr>
       <w:r>
-        <w:t>$r_{ca_i}$: Đơn giá giờ của ca $i$ (có thể khác nhau giữa ca thường và ca cuối tuần/lễ)</w:t>
+        <w:t>$N_{toi,thuong}$: Số ca tối ngày thường đã hoàn thành trong kỳ</w:t>
       </w:r>
     </w:p>
     <w:p/>
@@ -28454,7 +26805,7 @@
         <w:spacing w:after="80"/>
       </w:pPr>
       <w:r>
-        <w:t>$P_{tre}$: Khoản khấu trừ do đi muộn (nếu có, theo chính sách)</w:t>
+        <w:t>$N_{cuoi_tuan}$: Số ca hoàn thành vào cuối tuần</w:t>
       </w:r>
     </w:p>
     <w:p/>
@@ -28463,7 +26814,34 @@
         <w:spacing w:after="80"/>
       </w:pPr>
       <w:r>
-        <w:t>$B_{bonus}$: Thưởng thêm (nếu Quản lý nhập thủ công)</w:t>
+        <w:t>$N_{ngay_le}$: Số ca hoàn thành vào ngày lễ</w:t>
+      </w:r>
+    </w:p>
+    <w:p/>
+    <w:p>
+      <w:pPr>
+        <w:spacing w:after="80"/>
+      </w:pPr>
+      <w:r>
+        <w:t>$R_{sang}$: Mức lương cố định cho một ca sáng</w:t>
+      </w:r>
+    </w:p>
+    <w:p/>
+    <w:p>
+      <w:pPr>
+        <w:spacing w:after="80"/>
+      </w:pPr>
+      <w:r>
+        <w:t>$R_{toi}$: Mức lương cố định cho một ca tối</w:t>
+      </w:r>
+    </w:p>
+    <w:p/>
+    <w:p>
+      <w:pPr>
+        <w:spacing w:after="80"/>
+      </w:pPr>
+      <w:r>
+        <w:t>$R_{ca}$: Mức lương gốc của ca sáng hoặc ca tối tương ứng</w:t>
       </w:r>
     </w:p>
     <w:p/>
@@ -28913,7 +27291,7 @@
           <w:color w:val="2E86AB"/>
           <w:sz w:val="26"/>
         </w:rPr>
-        <w:t>6.2.5. Payroll Engine Đa biến — Tuân thủ NĐ 38/2022/NĐ-CP</w:t>
+        <w:t>6.2.5. Tính lương theo 2 ca cố định có hệ số cuối tuần/lễ</w:t>
       </w:r>
     </w:p>
     <w:p/>
@@ -28922,16 +27300,7 @@
         <w:spacing w:after="80"/>
       </w:pPr>
       <w:r>
-        <w:t xml:space="preserve">Hệ thống loại bỏ công thức tính lương đơn giản và triển khai </w:t>
-      </w:r>
-      <w:r>
-        <w:rPr>
-          <w:b/>
-        </w:rPr>
-        <w:t>động cơ tính lương đa biến</w:t>
-      </w:r>
-      <w:r>
-        <w:t xml:space="preserve"> tuân thủ đầy đủ pháp luật lao động Việt Nam:</w:t>
+        <w:t>Hệ thống áp dụng mô hình tính lương gọn nhưng thực tế: chỉ có 2 ca sáng/tối, nhưng vẫn cộng hệ số cho cuối tuần và ngày lễ.</w:t>
       </w:r>
     </w:p>
     <w:p/>
@@ -28944,19 +27313,7 @@
           <w:rFonts w:ascii="Cambria Math" w:hAnsi="Cambria Math"/>
           <w:sz w:val="24"/>
         </w:rPr>
-        <w:t>$$S_{total} = \sum_{i=1}^{n} \left( H_{basic,i} \times R \right) + \sum_{j=1}^{m} \left( H_{OT,j} \times R \times M_j \right) + \sum_{k=1}^{p} \left( H_{night,k} \times R \times N_k \right) + A_{total} - D_{total}$$</w:t>
-      </w:r>
-    </w:p>
-    <w:p/>
-    <w:p>
-      <w:pPr>
-        <w:spacing w:after="80"/>
-      </w:pPr>
-      <w:r>
-        <w:rPr>
-          <w:b/>
-        </w:rPr>
-        <w:t>Giải thích các biến số:</w:t>
+        <w:t>$$S_{total} = (N_{sang} \times R_{sang}) + (N_{toi} \times R_{toi}) + (N_{cuoi_tuan} \times R_{ca} \times 1.5) + (N_{ngay_le} \times R_{ca} \times 2.0)$$</w:t>
       </w:r>
     </w:p>
     <w:p/>
@@ -28984,7 +27341,7 @@
                 <w:color w:val="FFFFFF"/>
                 <w:sz w:val="22"/>
               </w:rPr>
-              <w:t>Biến</w:t>
+              <w:t>Loại ca</w:t>
             </w:r>
           </w:p>
         </w:tc>
@@ -29000,7 +27357,7 @@
                 <w:color w:val="FFFFFF"/>
                 <w:sz w:val="22"/>
               </w:rPr>
-              <w:t>Ý nghĩa</w:t>
+              <w:t>Khung giờ chuẩn</w:t>
             </w:r>
           </w:p>
         </w:tc>
@@ -29016,7 +27373,7 @@
                 <w:color w:val="FFFFFF"/>
                 <w:sz w:val="22"/>
               </w:rPr>
-              <w:t>Giá trị theo luật</w:t>
+              <w:t>Cách tính lương</w:t>
             </w:r>
           </w:p>
         </w:tc>
@@ -29031,32 +27388,33 @@
               <w:rPr>
                 <w:sz w:val="22"/>
               </w:rPr>
-              <w:t>$H_{basic,i}$</w:t>
-            </w:r>
-          </w:p>
-        </w:tc>
-        <w:tc>
-          <w:tcPr>
-            <w:tcW w:type="dxa" w:w="3024"/>
-          </w:tcPr>
-          <w:p>
-            <w:r>
-              <w:rPr>
-                <w:sz w:val="22"/>
-              </w:rPr>
-              <w:t>Giờ hành chính tiêu chuẩn</w:t>
-            </w:r>
-          </w:p>
-        </w:tc>
-        <w:tc>
-          <w:tcPr>
-            <w:tcW w:type="dxa" w:w="3024"/>
-          </w:tcPr>
-          <w:p>
-            <w:r>
-              <w:rPr>
-                <w:sz w:val="22"/>
-              </w:rPr>
+              <w:t>Ca sáng</w:t>
+            </w:r>
+          </w:p>
+        </w:tc>
+        <w:tc>
+          <w:tcPr>
+            <w:tcW w:type="dxa" w:w="3024"/>
+          </w:tcPr>
+          <w:p>
+            <w:r>
+              <w:rPr>
+                <w:sz w:val="22"/>
+              </w:rPr>
+              <w:t>06:00 - 12:00</w:t>
+            </w:r>
+          </w:p>
+        </w:tc>
+        <w:tc>
+          <w:tcPr>
+            <w:tcW w:type="dxa" w:w="3024"/>
+          </w:tcPr>
+          <w:p>
+            <w:r>
+              <w:rPr>
+                <w:sz w:val="22"/>
+              </w:rPr>
+              <w:t>Cộng R_sang khi hoàn thành đủ ca</w:t>
             </w:r>
           </w:p>
         </w:tc>
@@ -29072,35 +27430,35 @@
               <w:rPr>
                 <w:sz w:val="22"/>
               </w:rPr>
-              <w:t>$R$</w:t>
-            </w:r>
-          </w:p>
-        </w:tc>
-        <w:tc>
-          <w:tcPr>
-            <w:tcW w:type="dxa" w:w="3024"/>
-            <w:shd w:val="clear" w:color="auto" w:fill="EBF4FB"/>
-          </w:tcPr>
-          <w:p>
-            <w:r>
-              <w:rPr>
-                <w:sz w:val="22"/>
-              </w:rPr>
-              <w:t>Lương cơ bản theo giờ</w:t>
-            </w:r>
-          </w:p>
-        </w:tc>
-        <w:tc>
-          <w:tcPr>
-            <w:tcW w:type="dxa" w:w="3024"/>
-            <w:shd w:val="clear" w:color="auto" w:fill="EBF4FB"/>
-          </w:tcPr>
-          <w:p>
-            <w:r>
-              <w:rPr>
-                <w:sz w:val="22"/>
-              </w:rPr>
-              <w:t>≥ 22.500 đ/giờ (Vùng I, 2024)</w:t>
+              <w:t>Ca tối</w:t>
+            </w:r>
+          </w:p>
+        </w:tc>
+        <w:tc>
+          <w:tcPr>
+            <w:tcW w:type="dxa" w:w="3024"/>
+            <w:shd w:val="clear" w:color="auto" w:fill="EBF4FB"/>
+          </w:tcPr>
+          <w:p>
+            <w:r>
+              <w:rPr>
+                <w:sz w:val="22"/>
+              </w:rPr>
+              <w:t>16:00 - 22:00</w:t>
+            </w:r>
+          </w:p>
+        </w:tc>
+        <w:tc>
+          <w:tcPr>
+            <w:tcW w:type="dxa" w:w="3024"/>
+            <w:shd w:val="clear" w:color="auto" w:fill="EBF4FB"/>
+          </w:tcPr>
+          <w:p>
+            <w:r>
+              <w:rPr>
+                <w:sz w:val="22"/>
+              </w:rPr>
+              <w:t>Cộng R_toi khi hoàn thành đủ ca</w:t>
             </w:r>
           </w:p>
         </w:tc>
@@ -29115,33 +27473,33 @@
               <w:rPr>
                 <w:sz w:val="22"/>
               </w:rPr>
-              <w:t>$H_{OT,j}$</w:t>
-            </w:r>
-          </w:p>
-        </w:tc>
-        <w:tc>
-          <w:tcPr>
-            <w:tcW w:type="dxa" w:w="3024"/>
-          </w:tcPr>
-          <w:p>
-            <w:r>
-              <w:rPr>
-                <w:sz w:val="22"/>
-              </w:rPr>
-              <w:t>Giờ làm thêm (tăng ca)</w:t>
-            </w:r>
-          </w:p>
-        </w:tc>
-        <w:tc>
-          <w:tcPr>
-            <w:tcW w:type="dxa" w:w="3024"/>
-          </w:tcPr>
-          <w:p>
-            <w:r>
-              <w:rPr>
-                <w:sz w:val="22"/>
-              </w:rPr>
-              <w:t>≤ 40h/tháng, ≤ 200h/năm</w:t>
+              <w:t>Ca cuối tuần</w:t>
+            </w:r>
+          </w:p>
+        </w:tc>
+        <w:tc>
+          <w:tcPr>
+            <w:tcW w:type="dxa" w:w="3024"/>
+          </w:tcPr>
+          <w:p>
+            <w:r>
+              <w:rPr>
+                <w:sz w:val="22"/>
+              </w:rPr>
+              <w:t>Theo ca sáng hoặc ca tối</w:t>
+            </w:r>
+          </w:p>
+        </w:tc>
+        <w:tc>
+          <w:tcPr>
+            <w:tcW w:type="dxa" w:w="3024"/>
+          </w:tcPr>
+          <w:p>
+            <w:r>
+              <w:rPr>
+                <w:sz w:val="22"/>
+              </w:rPr>
+              <w:t>Nhân hệ số 1.5 trên đơn giá ca tương ứng</w:t>
             </w:r>
           </w:p>
         </w:tc>
@@ -29157,416 +27515,35 @@
               <w:rPr>
                 <w:sz w:val="22"/>
               </w:rPr>
-              <w:t>$M_j$</w:t>
-            </w:r>
-          </w:p>
-        </w:tc>
-        <w:tc>
-          <w:tcPr>
-            <w:tcW w:type="dxa" w:w="3024"/>
-            <w:shd w:val="clear" w:color="auto" w:fill="EBF4FB"/>
-          </w:tcPr>
-          <w:p>
-            <w:r>
-              <w:rPr>
-                <w:sz w:val="22"/>
-              </w:rPr>
-              <w:t>Hệ số tăng ca</w:t>
-            </w:r>
-          </w:p>
-        </w:tc>
-        <w:tc>
-          <w:tcPr>
-            <w:tcW w:type="dxa" w:w="3024"/>
-            <w:shd w:val="clear" w:color="auto" w:fill="EBF4FB"/>
-          </w:tcPr>
-          <w:p>
-            <w:r>
-              <w:rPr>
-                <w:sz w:val="22"/>
-              </w:rPr>
-              <w:t>1.5 (ngày thường) / 2.0 (ngày nghỉ) / 3.0 (Lễ, Tết)</w:t>
-            </w:r>
-          </w:p>
-        </w:tc>
-      </w:tr>
-      <w:tr>
-        <w:tc>
-          <w:tcPr>
-            <w:tcW w:type="dxa" w:w="3024"/>
-          </w:tcPr>
-          <w:p>
-            <w:r>
-              <w:rPr>
-                <w:sz w:val="22"/>
-              </w:rPr>
-              <w:t>$H_{night,k}$</w:t>
-            </w:r>
-          </w:p>
-        </w:tc>
-        <w:tc>
-          <w:tcPr>
-            <w:tcW w:type="dxa" w:w="3024"/>
-          </w:tcPr>
-          <w:p>
-            <w:r>
-              <w:rPr>
-                <w:sz w:val="22"/>
-              </w:rPr>
-              <w:t>Giờ làm ca đêm (22:00–06:00)</w:t>
-            </w:r>
-          </w:p>
-        </w:tc>
-        <w:tc>
-          <w:tcPr>
-            <w:tcW w:type="dxa" w:w="3024"/>
-          </w:tcPr>
-          <w:p>
-            <w:r>
-              <w:rPr>
-                <w:sz w:val="22"/>
-              </w:rPr>
-              <w:t>Theo lịch thực tế</w:t>
-            </w:r>
-          </w:p>
-        </w:tc>
-      </w:tr>
-      <w:tr>
-        <w:tc>
-          <w:tcPr>
-            <w:tcW w:type="dxa" w:w="3024"/>
-            <w:shd w:val="clear" w:color="auto" w:fill="EBF4FB"/>
-          </w:tcPr>
-          <w:p>
-            <w:r>
-              <w:rPr>
-                <w:sz w:val="22"/>
-              </w:rPr>
-              <w:t>$N_k$</w:t>
-            </w:r>
-          </w:p>
-        </w:tc>
-        <w:tc>
-          <w:tcPr>
-            <w:tcW w:type="dxa" w:w="3024"/>
-            <w:shd w:val="clear" w:color="auto" w:fill="EBF4FB"/>
-          </w:tcPr>
-          <w:p>
-            <w:r>
-              <w:rPr>
-                <w:sz w:val="22"/>
-              </w:rPr>
-              <w:t>Hệ số phụ cấp đêm</w:t>
-            </w:r>
-          </w:p>
-        </w:tc>
-        <w:tc>
-          <w:tcPr>
-            <w:tcW w:type="dxa" w:w="3024"/>
-            <w:shd w:val="clear" w:color="auto" w:fill="EBF4FB"/>
-          </w:tcPr>
-          <w:p>
-            <w:r>
-              <w:rPr>
-                <w:sz w:val="22"/>
-              </w:rPr>
-              <w:t>+30% (≥ 1.3); nếu vừa tăng ca vừa đêm → cộng thêm +20%</w:t>
-            </w:r>
-          </w:p>
-        </w:tc>
-      </w:tr>
-      <w:tr>
-        <w:tc>
-          <w:tcPr>
-            <w:tcW w:type="dxa" w:w="3024"/>
-          </w:tcPr>
-          <w:p>
-            <w:r>
-              <w:rPr>
-                <w:sz w:val="22"/>
-              </w:rPr>
-              <w:t>$A_{total}$</w:t>
-            </w:r>
-          </w:p>
-        </w:tc>
-        <w:tc>
-          <w:tcPr>
-            <w:tcW w:type="dxa" w:w="3024"/>
-          </w:tcPr>
-          <w:p>
-            <w:r>
-              <w:rPr>
-                <w:sz w:val="22"/>
-              </w:rPr>
-              <w:t>Tổng phụ cấp (ăn ca, xăng xe...)</w:t>
-            </w:r>
-          </w:p>
-        </w:tc>
-        <w:tc>
-          <w:tcPr>
-            <w:tcW w:type="dxa" w:w="3024"/>
-          </w:tcPr>
-          <w:p>
-            <w:r>
-              <w:rPr>
-                <w:sz w:val="22"/>
-              </w:rPr>
-              <w:t>Theo chính sách quán</w:t>
-            </w:r>
-          </w:p>
-        </w:tc>
-      </w:tr>
-      <w:tr>
-        <w:tc>
-          <w:tcPr>
-            <w:tcW w:type="dxa" w:w="3024"/>
-            <w:shd w:val="clear" w:color="auto" w:fill="EBF4FB"/>
-          </w:tcPr>
-          <w:p>
-            <w:r>
-              <w:rPr>
-                <w:sz w:val="22"/>
-              </w:rPr>
-              <w:t>$D_{total}$</w:t>
-            </w:r>
-          </w:p>
-        </w:tc>
-        <w:tc>
-          <w:tcPr>
-            <w:tcW w:type="dxa" w:w="3024"/>
-            <w:shd w:val="clear" w:color="auto" w:fill="EBF4FB"/>
-          </w:tcPr>
-          <w:p>
-            <w:r>
-              <w:rPr>
-                <w:sz w:val="22"/>
-              </w:rPr>
-              <w:t>Tổng khấu trừ (BHXH, đi muộn...)</w:t>
-            </w:r>
-          </w:p>
-        </w:tc>
-        <w:tc>
-          <w:tcPr>
-            <w:tcW w:type="dxa" w:w="3024"/>
-            <w:shd w:val="clear" w:color="auto" w:fill="EBF4FB"/>
-          </w:tcPr>
-          <w:p>
-            <w:r>
-              <w:rPr>
-                <w:sz w:val="22"/>
-              </w:rPr>
-              <w:t>Theo chính sách + pháp luật</w:t>
-            </w:r>
-          </w:p>
-        </w:tc>
-      </w:tr>
-    </w:tbl>
-    <w:p/>
-    <w:p/>
-    <w:p>
-      <w:pPr>
-        <w:spacing w:after="80"/>
-      </w:pPr>
-      <w:r>
-        <w:rPr>
-          <w:b/>
-        </w:rPr>
-        <w:t>Kiến trúc tách biệt hệ số khỏi mã nguồn:</w:t>
-      </w:r>
-    </w:p>
-    <w:p/>
-    <w:p>
-      <w:pPr>
-        <w:spacing w:after="80"/>
-      </w:pPr>
-      <w:r>
-        <w:rPr>
-          <w:i/>
-        </w:rPr>
-        <w:t xml:space="preserve">Mọi hệ số $M_j$ và $N_k$ được lưu trong </w:t>
-      </w:r>
-      <w:r>
-        <w:rPr>
-          <w:i/>
-        </w:rPr>
-        <w:t>Bảng ma trận cấu hình (Compliance Matrix)</w:t>
-      </w:r>
-      <w:r>
-        <w:rPr>
-          <w:i/>
-        </w:rPr>
-        <w:t xml:space="preserve"> riêng biệt trong CSDL, không hardcode vào logic code. Khi Chính phủ ban hành quy định mới, Nhân sự chỉ cần cập nhật bảng cấu hình mà </w:t>
-      </w:r>
-      <w:r>
-        <w:rPr>
-          <w:i/>
-        </w:rPr>
-        <w:t>không cần phát hành phiên bản phần mềm mới</w:t>
-      </w:r>
-      <w:r>
-        <w:rPr>
-          <w:i/>
-        </w:rPr>
-        <w:t>.</w:t>
-      </w:r>
-    </w:p>
-    <w:p/>
-    <w:tbl>
-      <w:tblPr>
-        <w:tblStyle w:val="TableGrid"/>
-        <w:tblW w:type="auto" w:w="0"/>
-        <w:tblLook w:firstColumn="1" w:firstRow="1" w:lastColumn="0" w:lastRow="0" w:noHBand="0" w:noVBand="1" w:val="04A0"/>
-      </w:tblPr>
-      <w:tblGrid>
-        <w:gridCol w:w="4535"/>
-        <w:gridCol w:w="4535"/>
-      </w:tblGrid>
-      <w:tr>
-        <w:tc>
-          <w:tcPr>
-            <w:tcW w:type="dxa" w:w="4535"/>
-            <w:shd w:val="clear" w:color="auto" w:fill="1F619E"/>
-          </w:tcPr>
-          <w:p>
-            <w:r>
-              <w:rPr>
-                <w:b/>
-                <w:color w:val="FFFFFF"/>
-                <w:sz w:val="22"/>
-              </w:rPr>
-              <w:t>Bảng</w:t>
-            </w:r>
-          </w:p>
-        </w:tc>
-        <w:tc>
-          <w:tcPr>
-            <w:tcW w:type="dxa" w:w="4535"/>
-            <w:shd w:val="clear" w:color="auto" w:fill="1F619E"/>
-          </w:tcPr>
-          <w:p>
-            <w:r>
-              <w:rPr>
-                <w:b/>
-                <w:color w:val="FFFFFF"/>
-                <w:sz w:val="22"/>
-              </w:rPr>
-              <w:t>compliance_matrix</w:t>
-            </w:r>
-          </w:p>
-        </w:tc>
-      </w:tr>
-      <w:tr>
-        <w:tc>
-          <w:tcPr>
-            <w:tcW w:type="dxa" w:w="4535"/>
-          </w:tcPr>
-          <w:p>
-            <w:r>
-              <w:rPr>
-                <w:sz w:val="22"/>
-              </w:rPr>
-              <w:t>loai_ca</w:t>
-            </w:r>
-          </w:p>
-        </w:tc>
-        <w:tc>
-          <w:tcPr>
-            <w:tcW w:type="dxa" w:w="4535"/>
-          </w:tcPr>
-          <w:p>
-            <w:r>
-              <w:rPr>
-                <w:sz w:val="22"/>
-              </w:rPr>
-              <w:t>ENUM: 'ngay_thuong', 'ngay_nghi', 'le_tet', 'ca_dem'</w:t>
-            </w:r>
-          </w:p>
-        </w:tc>
-      </w:tr>
-      <w:tr>
-        <w:tc>
-          <w:tcPr>
-            <w:tcW w:type="dxa" w:w="4535"/>
-            <w:shd w:val="clear" w:color="auto" w:fill="EBF4FB"/>
-          </w:tcPr>
-          <w:p>
-            <w:r>
-              <w:rPr>
-                <w:sz w:val="22"/>
-              </w:rPr>
-              <w:t>he_so</w:t>
-            </w:r>
-          </w:p>
-        </w:tc>
-        <w:tc>
-          <w:tcPr>
-            <w:tcW w:type="dxa" w:w="4535"/>
-            <w:shd w:val="clear" w:color="auto" w:fill="EBF4FB"/>
-          </w:tcPr>
-          <w:p>
-            <w:r>
-              <w:rPr>
-                <w:sz w:val="22"/>
-              </w:rPr>
-              <w:t>DECIMAL(4,2) — hệ số áp dụng</w:t>
-            </w:r>
-          </w:p>
-        </w:tc>
-      </w:tr>
-      <w:tr>
-        <w:tc>
-          <w:tcPr>
-            <w:tcW w:type="dxa" w:w="4535"/>
-          </w:tcPr>
-          <w:p>
-            <w:r>
-              <w:rPr>
-                <w:sz w:val="22"/>
-              </w:rPr>
-              <w:t>hieu_luc_tu</w:t>
-            </w:r>
-          </w:p>
-        </w:tc>
-        <w:tc>
-          <w:tcPr>
-            <w:tcW w:type="dxa" w:w="4535"/>
-          </w:tcPr>
-          <w:p>
-            <w:r>
-              <w:rPr>
-                <w:sz w:val="22"/>
-              </w:rPr>
-              <w:t>DATE — ngày bắt đầu hiệu lực</w:t>
-            </w:r>
-          </w:p>
-        </w:tc>
-      </w:tr>
-      <w:tr>
-        <w:tc>
-          <w:tcPr>
-            <w:tcW w:type="dxa" w:w="4535"/>
-            <w:shd w:val="clear" w:color="auto" w:fill="EBF4FB"/>
-          </w:tcPr>
-          <w:p>
-            <w:r>
-              <w:rPr>
-                <w:sz w:val="22"/>
-              </w:rPr>
-              <w:t>van_ban_phap_ly</w:t>
-            </w:r>
-          </w:p>
-        </w:tc>
-        <w:tc>
-          <w:tcPr>
-            <w:tcW w:type="dxa" w:w="4535"/>
-            <w:shd w:val="clear" w:color="auto" w:fill="EBF4FB"/>
-          </w:tcPr>
-          <w:p>
-            <w:r>
-              <w:rPr>
-                <w:sz w:val="22"/>
-              </w:rPr>
-              <w:t>VARCHAR — số nghị định tham chiếu</w:t>
+              <w:t>Ca ngày lễ</w:t>
+            </w:r>
+          </w:p>
+        </w:tc>
+        <w:tc>
+          <w:tcPr>
+            <w:tcW w:type="dxa" w:w="3024"/>
+            <w:shd w:val="clear" w:color="auto" w:fill="EBF4FB"/>
+          </w:tcPr>
+          <w:p>
+            <w:r>
+              <w:rPr>
+                <w:sz w:val="22"/>
+              </w:rPr>
+              <w:t>Theo ca sáng hoặc ca tối</w:t>
+            </w:r>
+          </w:p>
+        </w:tc>
+        <w:tc>
+          <w:tcPr>
+            <w:tcW w:type="dxa" w:w="3024"/>
+            <w:shd w:val="clear" w:color="auto" w:fill="EBF4FB"/>
+          </w:tcPr>
+          <w:p>
+            <w:r>
+              <w:rPr>
+                <w:sz w:val="22"/>
+              </w:rPr>
+              <w:t>Nhân hệ số 2.0 trên đơn giá ca tương ứng</w:t>
             </w:r>
           </w:p>
         </w:tc>
@@ -29889,20 +27866,20 @@
               <w:rPr>
                 <w:sz w:val="22"/>
               </w:rPr>
-              <w:t>so_gio_lam không được tính nếu check_out_time IS NULL</w:t>
-            </w:r>
-          </w:p>
-        </w:tc>
-        <w:tc>
-          <w:tcPr>
-            <w:tcW w:type="dxa" w:w="3024"/>
-          </w:tcPr>
-          <w:p>
-            <w:r>
-              <w:rPr>
-                <w:sz w:val="22"/>
-              </w:rPr>
-              <w:t>Dùng CASE WHEN trong câu truy vấn tính lương</w:t>
+              <w:t>Chỉ ca có đủ check_in_time và check_out_time mới được đưa vào bảng lương</w:t>
+            </w:r>
+          </w:p>
+        </w:tc>
+        <w:tc>
+          <w:tcPr>
+            <w:tcW w:type="dxa" w:w="3024"/>
+          </w:tcPr>
+          <w:p>
+            <w:r>
+              <w:rPr>
+                <w:sz w:val="22"/>
+              </w:rPr>
+              <w:t>Dùng CASE WHEN hoặc cờ trạng thái hợp lệ khi tổng hợp lương</w:t>
             </w:r>
           </w:p>
         </w:tc>
@@ -29974,20 +27951,20 @@
               <w:rPr>
                 <w:sz w:val="22"/>
               </w:rPr>
-              <w:t>Ca cuối tuần (Thứ 7, Chủ nhật) được nhân hệ số 1.5</w:t>
-            </w:r>
-          </w:p>
-        </w:tc>
-        <w:tc>
-          <w:tcPr>
-            <w:tcW w:type="dxa" w:w="3024"/>
-          </w:tcPr>
-          <w:p>
-            <w:r>
-              <w:rPr>
-                <w:sz w:val="22"/>
-              </w:rPr>
-              <w:t>Hàm tính lương kiểm tra DAYOFWEEK(ngay_lam_viec) trước khi áp đơn giá</w:t>
+              <w:t>Mỗi ca phải thuộc đúng 1 trong 2 loại: sang hoặc toi; nếu rơi vào cuối tuần/ngày lễ thì áp đúng hệ số</w:t>
+            </w:r>
+          </w:p>
+        </w:tc>
+        <w:tc>
+          <w:tcPr>
+            <w:tcW w:type="dxa" w:w="3024"/>
+          </w:tcPr>
+          <w:p>
+            <w:r>
+              <w:rPr>
+                <w:sz w:val="22"/>
+              </w:rPr>
+              <w:t>Ràng buộc ENUM / validation ngày làm việc và cờ loại ngày</w:t>
             </w:r>
           </w:p>
         </w:tc>
@@ -30660,7 +28637,7 @@
               <w:rPr>
                 <w:sz w:val="22"/>
               </w:rPr>
-              <w:t>Tính lương ca thường</w:t>
+              <w:t>Tính lương 1 ca sáng ngày thường</w:t>
             </w:r>
           </w:p>
         </w:tc>
@@ -30673,7 +28650,7 @@
               <w:rPr>
                 <w:sz w:val="22"/>
               </w:rPr>
-              <w:t>8 giờ làm, đơn giá 25.000đ/giờ</w:t>
+              <w:t>Hoàn thành 1 ca sáng, R_sang = 120.000đ</w:t>
             </w:r>
           </w:p>
         </w:tc>
@@ -30686,7 +28663,7 @@
               <w:rPr>
                 <w:sz w:val="22"/>
               </w:rPr>
-              <w:t>Lương = 8 × 25.000 = 200.000đ</w:t>
+              <w:t>Lương = 120.000đ</w:t>
             </w:r>
           </w:p>
         </w:tc>
@@ -30716,7 +28693,7 @@
               <w:rPr>
                 <w:sz w:val="22"/>
               </w:rPr>
-              <w:t>Tính lương ca cuối tuần</w:t>
+              <w:t>Tính lương 1 ca tối cuối tuần</w:t>
             </w:r>
           </w:p>
         </w:tc>
@@ -30730,7 +28707,7 @@
               <w:rPr>
                 <w:sz w:val="22"/>
               </w:rPr>
-              <w:t>8 giờ làm, đơn giá 25.000đ/giờ, hệ số 1.5</w:t>
+              <w:t>Hoàn thành 1 ca tối cuối tuần, R_toi = 140.000đ</w:t>
             </w:r>
           </w:p>
         </w:tc>
@@ -30744,7 +28721,7 @@
               <w:rPr>
                 <w:sz w:val="22"/>
               </w:rPr>
-              <w:t>Lương = 8 × 25.000 × 1.5 = 300.000đ</w:t>
+              <w:t>Lương = 140.000 × 1.5 = 210.000đ</w:t>
             </w:r>
           </w:p>
         </w:tc>
@@ -30798,7 +28775,7 @@
               <w:rPr>
                 <w:sz w:val="22"/>
               </w:rPr>
-              <w:t>so_gio_lam = 0; không tính vào lương</w:t>
+              <w:t>Chưa đưa vào bảng lương, chờ quản lý xác nhận</w:t>
             </w:r>
           </w:p>
         </w:tc>
@@ -30842,7 +28819,7 @@
               <w:rPr>
                 <w:sz w:val="22"/>
               </w:rPr>
-              <w:t>22 ca thường (8h) + 4 ca cuối tuần (8h)</w:t>
+              <w:t>18 ca sáng ngày thường + 8 ca tối ngày thường + 2 ca tối cuối tuần + 1 ca sáng ngày lễ</w:t>
             </w:r>
           </w:p>
         </w:tc>
@@ -30856,7 +28833,7 @@
               <w:rPr>
                 <w:sz w:val="22"/>
               </w:rPr>
-              <w:t>L = 22×8×25k + 4×8×25k×1.5 = 4.400.000 + 1.200.000 = 5.600.000đ</w:t>
+              <w:t>L = 18×120.000 + 8×140.000 + 2×140.000×1.5 + 1×120.000×2.0 = 3.940.000đ</w:t>
             </w:r>
           </w:p>
         </w:tc>
@@ -31138,20 +29115,21 @@
               <w:rPr>
                 <w:sz w:val="22"/>
               </w:rPr>
-              <w:t>Phê duyệt tăng ca</w:t>
-            </w:r>
-          </w:p>
-        </w:tc>
-        <w:tc>
-          <w:tcPr>
-            <w:tcW w:type="dxa" w:w="3024"/>
-            <w:shd w:val="clear" w:color="auto" w:fill="EBF4FB"/>
-          </w:tcPr>
-          <w:p>
-            <w:r>
-              <w:rPr>
-                <w:sz w:val="22"/>
-              </w:rPr>
+              <w:t>Phê duyệt tăng ca cuối tuần/lễ</w:t>
+            </w:r>
+          </w:p>
+        </w:tc>
+        <w:tc>
+          <w:tcPr>
+            <w:tcW w:type="dxa" w:w="3024"/>
+            <w:shd w:val="clear" w:color="auto" w:fill="EBF4FB"/>
+          </w:tcPr>
+          <w:p>
+            <w:r>
+              <w:rPr>
+                <w:sz w:val="22"/>
+              </w:rPr>
+              <w:t>Cho phép Manager xác nhận ca đặc biệt trước khi chốt lương</w:t>
             </w:r>
           </w:p>
         </w:tc>
@@ -32352,20 +30330,20 @@
               <w:rPr>
                 <w:sz w:val="22"/>
               </w:rPr>
-              <w:t>Lương theo giờ &lt; mức lương tối thiểu vùng</w:t>
-            </w:r>
-          </w:p>
-        </w:tc>
-        <w:tc>
-          <w:tcPr>
-            <w:tcW w:type="dxa" w:w="3024"/>
-          </w:tcPr>
-          <w:p>
-            <w:r>
-              <w:rPr>
-                <w:sz w:val="22"/>
-              </w:rPr>
-              <w:t>Cảnh báo: _"Mức lương thấp hơn quy định (22.500đ/giờ). Xác nhận tiếp tục?"_</w:t>
+              <w:t>Mức lương ca nhập vào không hợp lệ</w:t>
+            </w:r>
+          </w:p>
+        </w:tc>
+        <w:tc>
+          <w:tcPr>
+            <w:tcW w:type="dxa" w:w="3024"/>
+          </w:tcPr>
+          <w:p>
+            <w:r>
+              <w:rPr>
+                <w:sz w:val="22"/>
+              </w:rPr>
+              <w:t>Cảnh báo: _"Mức lương ca chưa phù hợp. Vui lòng kiểm tra lại hoặc xác nhận tiếp tục."_</w:t>
             </w:r>
           </w:p>
         </w:tc>
@@ -34699,7 +32677,7 @@
               <w:rPr>
                 <w:sz w:val="22"/>
               </w:rPr>
-              <w:t>Lương thấp hơn tối thiểu vùng</w:t>
+              <w:t>Mức lương ca nhập không hợp lệ</w:t>
             </w:r>
           </w:p>
         </w:tc>
@@ -34713,7 +32691,7 @@
               <w:rPr>
                 <w:sz w:val="22"/>
               </w:rPr>
-              <w:t>luong_gio = 15000 (&lt; 22.500đ)</w:t>
+              <w:t>Mức lương ca sáng hoặc ca tối nhỏ hơn cấu hình tối thiểu của quán</w:t>
             </w:r>
           </w:p>
         </w:tc>

</xml_diff>